<commit_message>
Rename Part A headings, consolidate model details, fold rejected alternative into Part B stores trade-off
Co-Authored-By: Claude Fable 5.1 <noreply@anthropic.com>
</commit_message>
<xml_diff>
--- a/SUBMISSION.docx
+++ b/SUBMISSION.docx
@@ -908,9 +908,9 @@
       <w:pPr>
         <w:pStyle w:val="Heading2"/>
       </w:pPr>
-      <w:bookmarkStart w:id="17" w:name="_856ddce067773e8905670bf2e3d72e65b1f23c2"/>
-      <w:r>
-        <w:t xml:space="preserve">The idea in three sentences</w:t>
+      <w:bookmarkStart w:id="17" w:name="_5e1d36f7a99ed0b17c1498734a88e62d0d2db39"/>
+      <w:r>
+        <w:t xml:space="preserve">Data model ideation</w:t>
       </w:r>
       <w:bookmarkEnd w:id="17"/>
     </w:p>
@@ -1091,147 +1091,38 @@
         <w:t xml:space="preserve">fact → dim_site_identifier → dim_site</w:t>
       </w:r>
       <w:r>
-        <w:t xml:space="preserve">.</w:t>
+        <w:t xml:space="preserve">. That one join is the</w:t>
+      </w:r>
+      <w:r>
+        <w:t xml:space="preserve"> </w:t>
+      </w:r>
+      <w:r>
+        <w:t xml:space="preserve">model’s only snowflake; it exists because identity decisions change and facts should not. The</w:t>
+      </w:r>
+      <w:r>
+        <w:t xml:space="preserve"> </w:t>
+      </w:r>
+      <w:r>
+        <w:t xml:space="preserve">analytics marts flatten it away into a plain star.</w:t>
       </w:r>
     </w:p>
     <w:p>
       <w:pPr>
         <w:pStyle w:val="Heading2"/>
       </w:pPr>
-      <w:bookmarkStart w:id="18" w:name="_35d70a3f287ccf84b525cf882b8b1ad587fe7a5"/>
-      <w:r>
-        <w:t xml:space="preserve">Star or snowflake?</w:t>
+      <w:bookmarkStart w:id="18" w:name="_d27986de5c7b38e67e1e65f363e5b001c41bdd2"/>
+      <w:r>
+        <w:t xml:space="preserve">Model details</w:t>
       </w:r>
       <w:bookmarkEnd w:id="18"/>
     </w:p>
     <w:p>
       <w:pPr>
-        <w:pStyle w:val="Compact"/>
-        <w:numPr>
-          <w:ilvl w:val="0"/>
-          <w:numId w:val="1003"/>
-        </w:numPr>
+        <w:pStyle w:val="FirstParagraph"/>
       </w:pPr>
       <w:r>
-        <w:rPr>
-          <w:b/>
-          <w:bCs/>
-        </w:rPr>
-        <w:t xml:space="preserve">Core model (Postgres, system of record):</w:t>
-      </w:r>
-      <w:r>
-        <w:t xml:space="preserve"> </w:t>
-      </w:r>
-      <w:r>
-        <w:t xml:space="preserve">a star with one deliberate snowflake. Facts</w:t>
-      </w:r>
-      <w:r>
-        <w:t xml:space="preserve"> </w:t>
-      </w:r>
-      <w:r>
-        <w:t xml:space="preserve">don’t carry</w:t>
-      </w:r>
-      <w:r>
-        <w:t xml:space="preserve"> </w:t>
-      </w:r>
-      <w:r>
-        <w:rPr>
-          <w:rStyle w:val="VerbatimChar"/>
-        </w:rPr>
-        <w:t xml:space="preserve">site_key</w:t>
-      </w:r>
-      <w:r>
-        <w:t xml:space="preserve">; they carry the agency identifier, and the bridge resolves it.</w:t>
-      </w:r>
-      <w:r>
-        <w:t xml:space="preserve"> </w:t>
-      </w:r>
-      <w:r>
-        <w:t xml:space="preserve">Reason: identity decisions change (merges, splits, better matching rules). Updating a few</w:t>
-      </w:r>
-      <w:r>
-        <w:t xml:space="preserve"> </w:t>
-      </w:r>
-      <w:r>
-        <w:t xml:space="preserve">hundred bridge rows is cheap and keeps history; rewriting millions of fact rows is neither.</w:t>
-      </w:r>
-    </w:p>
-    <w:p>
-      <w:pPr>
-        <w:pStyle w:val="Compact"/>
-        <w:numPr>
-          <w:ilvl w:val="0"/>
-          <w:numId w:val="1003"/>
-        </w:numPr>
-      </w:pPr>
-      <w:r>
-        <w:rPr>
-          <w:b/>
-          <w:bCs/>
-        </w:rPr>
-        <w:t xml:space="preserve">Analytics marts (Snowflake warehouse, U4):</w:t>
-      </w:r>
-      <w:r>
-        <w:t xml:space="preserve"> </w:t>
-      </w:r>
-      <w:r>
-        <w:t xml:space="preserve">a pure star. The nightly load flattens</w:t>
-      </w:r>
-      <w:r>
-        <w:t xml:space="preserve"> </w:t>
-      </w:r>
-      <w:r>
-        <w:t xml:space="preserve">through the bridge and puts</w:t>
-      </w:r>
-      <w:r>
-        <w:t xml:space="preserve"> </w:t>
-      </w:r>
-      <w:r>
-        <w:rPr>
-          <w:rStyle w:val="VerbatimChar"/>
-        </w:rPr>
-        <w:t xml:space="preserve">site_key</w:t>
-      </w:r>
-      <w:r>
-        <w:t xml:space="preserve">,</w:t>
-      </w:r>
-      <w:r>
-        <w:t xml:space="preserve"> </w:t>
-      </w:r>
-      <w:r>
-        <w:rPr>
-          <w:rStyle w:val="VerbatimChar"/>
-        </w:rPr>
-        <w:t xml:space="preserve">country_code</w:t>
-      </w:r>
-      <w:r>
-        <w:t xml:space="preserve">,</w:t>
-      </w:r>
-      <w:r>
-        <w:t xml:space="preserve"> </w:t>
-      </w:r>
-      <w:r>
-        <w:rPr>
-          <w:rStyle w:val="VerbatimChar"/>
-        </w:rPr>
-        <w:t xml:space="preserve">quarter</w:t>
-      </w:r>
-      <w:r>
-        <w:t xml:space="preserve"> </w:t>
-      </w:r>
-      <w:r>
-        <w:t xml:space="preserve">directly on the fact.</w:t>
-      </w:r>
-    </w:p>
-    <w:p>
-      <w:pPr>
-        <w:pStyle w:val="Heading2"/>
-      </w:pPr>
-      <w:bookmarkStart w:id="19" w:name="_db3999c300d54c01837c000c0c38a9973313412"/>
-      <w:r>
-        <w:t xml:space="preserve">SCD2 convention used everywhere</w:t>
-      </w:r>
-      <w:bookmarkEnd w:id="19"/>
+        <w:t xml:space="preserve">Every versioned table uses the same three columns:</w:t>
+      </w:r>
     </w:p>
     <w:tbl>
       <w:tblPr>
@@ -1433,13 +1324,11 @@
     </w:p>
     <w:p>
       <w:pPr>
-        <w:pStyle w:val="Heading2"/>
+        <w:pStyle w:val="BodyText"/>
       </w:pPr>
-      <w:bookmarkStart w:id="20" w:name="_6551072ee3fd3a7e55ae53c8be6276e2d3941e0"/>
-      <w:r>
-        <w:t xml:space="preserve">The 12 tables, one line each</w:t>
-      </w:r>
-      <w:bookmarkEnd w:id="20"/>
+      <w:r>
+        <w:t xml:space="preserve">The 12 tables:</w:t>
+      </w:r>
     </w:p>
     <w:tbl>
       <w:tblPr>
@@ -2177,11 +2066,11 @@
       <w:pPr>
         <w:pStyle w:val="Heading2"/>
       </w:pPr>
-      <w:bookmarkStart w:id="21" w:name="_1fa47c7fa30b6a219ebfc12d689d79689d8c776"/>
+      <w:bookmarkStart w:id="19" w:name="_1fa47c7fa30b6a219ebfc12d689d79689d8c776"/>
       <w:r>
         <w:t xml:space="preserve">How each consumer is served (A.3 and U1–U6)</w:t>
       </w:r>
-      <w:bookmarkEnd w:id="21"/>
+      <w:bookmarkEnd w:id="19"/>
     </w:p>
     <w:tbl>
       <w:tblPr>
@@ -2686,18 +2575,18 @@
       <w:pPr>
         <w:pStyle w:val="Heading3"/>
       </w:pPr>
-      <w:bookmarkStart w:id="22" w:name="_3e077a06a50ba14501ab0a71492ea86b0b20a01"/>
+      <w:bookmarkStart w:id="20" w:name="_3e077a06a50ba14501ab0a71492ea86b0b20a01"/>
       <w:r>
         <w:t xml:space="preserve">A.3 a–d in one place</w:t>
       </w:r>
-      <w:bookmarkEnd w:id="22"/>
+      <w:bookmarkEnd w:id="20"/>
     </w:p>
     <w:p>
       <w:pPr>
         <w:pStyle w:val="Compact"/>
         <w:numPr>
           <w:ilvl w:val="0"/>
-          <w:numId w:val="1004"/>
+          <w:numId w:val="1003"/>
         </w:numPr>
       </w:pPr>
       <w:r>
@@ -2815,7 +2704,7 @@
         <w:pStyle w:val="Compact"/>
         <w:numPr>
           <w:ilvl w:val="0"/>
-          <w:numId w:val="1004"/>
+          <w:numId w:val="1003"/>
         </w:numPr>
       </w:pPr>
       <w:r>
@@ -2837,7 +2726,7 @@
         <w:pStyle w:val="Compact"/>
         <w:numPr>
           <w:ilvl w:val="0"/>
-          <w:numId w:val="1004"/>
+          <w:numId w:val="1003"/>
         </w:numPr>
       </w:pPr>
       <w:r>
@@ -2934,7 +2823,7 @@
         <w:pStyle w:val="Compact"/>
         <w:numPr>
           <w:ilvl w:val="0"/>
-          <w:numId w:val="1004"/>
+          <w:numId w:val="1003"/>
         </w:numPr>
       </w:pPr>
       <w:r>
@@ -3027,11 +2916,11 @@
       <w:pPr>
         <w:pStyle w:val="Heading2"/>
       </w:pPr>
-      <w:bookmarkStart w:id="23" w:name="_be0660fb658c075e26b87a1a2888b97343663e1"/>
+      <w:bookmarkStart w:id="21" w:name="_be0660fb658c075e26b87a1a2888b97343663e1"/>
       <w:r>
         <w:t xml:space="preserve">A.2 Schema definitions: the five core tables</w:t>
       </w:r>
-      <w:bookmarkEnd w:id="23"/>
+      <w:bookmarkEnd w:id="21"/>
     </w:p>
     <w:p>
       <w:pPr>
@@ -6068,11 +5957,11 @@
       <w:pPr>
         <w:pStyle w:val="Heading2"/>
       </w:pPr>
-      <w:bookmarkStart w:id="24" w:name="_59ec9b44423b140962c4f2a55c5424c2db8f38f"/>
+      <w:bookmarkStart w:id="22" w:name="_59ec9b44423b140962c4f2a55c5424c2db8f38f"/>
       <w:r>
         <w:t xml:space="preserve">A.4 Queries for U2, U3, U4</w:t>
       </w:r>
-      <w:bookmarkEnd w:id="24"/>
+      <w:bookmarkEnd w:id="22"/>
     </w:p>
     <w:p>
       <w:pPr>
@@ -8889,21 +8778,21 @@
       <w:pPr>
         <w:pStyle w:val="Heading1"/>
       </w:pPr>
-      <w:bookmarkStart w:id="25" w:name="_15878c5d48f3a0fe82a47ecc6c19dac8b0cc288"/>
+      <w:bookmarkStart w:id="23" w:name="_15878c5d48f3a0fe82a47ecc6c19dac8b0cc288"/>
       <w:r>
         <w:t xml:space="preserve">Part B — Model rationale</w:t>
       </w:r>
-      <w:bookmarkEnd w:id="25"/>
+      <w:bookmarkEnd w:id="23"/>
     </w:p>
     <w:p>
       <w:pPr>
         <w:pStyle w:val="Heading2"/>
       </w:pPr>
-      <w:bookmarkStart w:id="26" w:name="_45d7bc8dbbb5d33ec5072bc7672e3e7d2c87c82"/>
+      <w:bookmarkStart w:id="24" w:name="_45d7bc8dbbb5d33ec5072bc7672e3e7d2c87c82"/>
       <w:r>
         <w:t xml:space="preserve">1. Stores: one record, purpose-built copies</w:t>
       </w:r>
-      <w:bookmarkEnd w:id="26"/>
+      <w:bookmarkEnd w:id="24"/>
     </w:p>
     <w:p>
       <w:pPr>
@@ -9354,7 +9243,7 @@
         <w:t xml:space="preserve"> </w:t>
       </w:r>
       <w:r>
-        <w:t xml:space="preserve">One more database than a Snowflake-only design. Accepted because the brief ranks a wrong merge as the worst outcome, and</w:t>
+        <w:t xml:space="preserve">One more database than the alternative I weighed seriously, Snowflake as the sole system of record (S3 → Snowpipe → dbt snapshots → marts, DynamoDB for alerts). Accepted because the brief ranks a wrong merge as the worst outcome, and</w:t>
       </w:r>
       <w:r>
         <w:t xml:space="preserve"> </w:t>
@@ -9375,18 +9264,18 @@
         <w:t xml:space="preserve">“a test would have caught it”</w:t>
       </w:r>
       <w:r>
-        <w:t xml:space="preserve">. Engines (Flink, Spark) are a separate question from stores; at today’s volumes they add a 24/7 cost without changing the design, so processing is SQL, Python on Fargate, and Lambda. They are the upgrade path at 10x.</w:t>
+        <w:t xml:space="preserve">; I would revisit it if the app stopped reading the model directly. Engines (Flink, Spark) are a separate question from stores; at today’s volumes they add a 24/7 cost without changing the design, so processing is SQL, Python on Fargate, and Lambda. They are the upgrade path at 10x.</w:t>
       </w:r>
     </w:p>
     <w:p>
       <w:pPr>
         <w:pStyle w:val="Heading2"/>
       </w:pPr>
-      <w:bookmarkStart w:id="27" w:name="_81fc686f57d52f568b6c0f1bd2afe569850ccff"/>
+      <w:bookmarkStart w:id="25" w:name="_81fc686f57d52f568b6c0f1bd2afe569850ccff"/>
       <w:r>
         <w:t xml:space="preserve">2. History and time</w:t>
       </w:r>
-      <w:bookmarkEnd w:id="27"/>
+      <w:bookmarkEnd w:id="25"/>
     </w:p>
     <w:p>
       <w:pPr>
@@ -9740,11 +9629,11 @@
       <w:pPr>
         <w:pStyle w:val="Heading2"/>
       </w:pPr>
-      <w:bookmarkStart w:id="28" w:name="_881eb6a07c36395ceedd9ba0be0a06bdd4991c5"/>
+      <w:bookmarkStart w:id="26" w:name="_881eb6a07c36395ceedd9ba0be0a06bdd4991c5"/>
       <w:r>
         <w:t xml:space="preserve">3. Site identity and entity resolution</w:t>
       </w:r>
-      <w:bookmarkEnd w:id="28"/>
+      <w:bookmarkEnd w:id="26"/>
     </w:p>
     <w:p>
       <w:pPr>
@@ -10173,11 +10062,11 @@
       <w:pPr>
         <w:pStyle w:val="Heading2"/>
       </w:pPr>
-      <w:bookmarkStart w:id="29" w:name="_2e726f220521770c8a5bf3c39aca6a41dca9700"/>
+      <w:bookmarkStart w:id="27" w:name="_2e726f220521770c8a5bf3c39aca6a41dca9700"/>
       <w:r>
         <w:t xml:space="preserve">4. Normalisation vs denormalisation</w:t>
       </w:r>
-      <w:bookmarkEnd w:id="29"/>
+      <w:bookmarkEnd w:id="27"/>
     </w:p>
     <w:p>
       <w:pPr>
@@ -10545,65 +10434,6 @@
     </w:p>
     <w:p>
       <w:pPr>
-        <w:pStyle w:val="Heading2"/>
-      </w:pPr>
-      <w:bookmarkStart w:id="30" w:name="_63a66e935e45a40fff4a8a7effe86c0981a901c"/>
-      <w:r>
-        <w:t xml:space="preserve">5. Alternative considered and rejected</w:t>
-      </w:r>
-      <w:bookmarkEnd w:id="30"/>
-    </w:p>
-    <w:p>
-      <w:pPr>
-        <w:pStyle w:val="FirstParagraph"/>
-      </w:pPr>
-      <w:r>
-        <w:rPr>
-          <w:b/>
-          <w:bCs/>
-        </w:rPr>
-        <w:t xml:space="preserve">Snowflake as the system of record</w:t>
-      </w:r>
-      <w:r>
-        <w:t xml:space="preserve">: S3 → Snowpipe → staging → dbt snapshots → marts, with DynamoDB for watchers and alerts. All on the stated stack, one database fewer. Rejected for three reasons specific to this brief: (1) primary keys and the one-identifier-one-site rule are declared but</w:t>
-      </w:r>
-      <w:r>
-        <w:t xml:space="preserve"> </w:t>
-      </w:r>
-      <w:r>
-        <w:rPr>
-          <w:b/>
-          <w:bCs/>
-        </w:rPr>
-        <w:t xml:space="preserve">not enforced</w:t>
-      </w:r>
-      <w:r>
-        <w:t xml:space="preserve"> </w:t>
-      </w:r>
-      <w:r>
-        <w:t xml:space="preserve">in a warehouse, so a bad matching run corrupts the bridge silently; (2) the customer app reads the model for U1, and a warehouse serving sub-second reads must stay running, a standing cost the brief asks us to justify; (3) S4/S5 are thousands of small per-event upserts, which a columnar engine handles poorly without extra components. Not a reason: transactions (Snowflake has them).</w:t>
-      </w:r>
-    </w:p>
-    <w:p>
-      <w:pPr>
-        <w:pStyle w:val="BodyText"/>
-      </w:pPr>
-      <w:r>
-        <w:rPr>
-          <w:b/>
-          <w:bCs/>
-        </w:rPr>
-        <w:t xml:space="preserve">What would make me revisit it.</w:t>
-      </w:r>
-      <w:r>
-        <w:t xml:space="preserve"> </w:t>
-      </w:r>
-      <w:r>
-        <w:t xml:space="preserve">If the app stopped reading the model directly (its own cache or DynamoDB for profiles) and the stream path wrote only to DynamoDB, Postgres would be serving nobody Snowflake could not, and the warehouse should become the record. Same DDL; constraints become tests.</w:t>
-      </w:r>
-    </w:p>
-    <w:p>
-      <w:pPr>
         <w:sectPr>
           <w:pgSz w:w="11906" w:h="16838"/>
           <w:pgMar w:top="850" w:right="850" w:bottom="850" w:left="850" w:header="567" w:footer="567" w:gutter="0"/>
@@ -10619,21 +10449,21 @@
       <w:pPr>
         <w:pStyle w:val="Heading1"/>
       </w:pPr>
-      <w:bookmarkStart w:id="31" w:name="_c3bdf1e69419d5864c443e9dbf78f8207a09f4e"/>
+      <w:bookmarkStart w:id="28" w:name="_c3bdf1e69419d5864c443e9dbf78f8207a09f4e"/>
       <w:r>
         <w:t xml:space="preserve">Part C — Pipeline architecture</w:t>
       </w:r>
-      <w:bookmarkEnd w:id="31"/>
+      <w:bookmarkEnd w:id="28"/>
     </w:p>
     <w:p>
       <w:pPr>
         <w:pStyle w:val="Heading2"/>
       </w:pPr>
-      <w:bookmarkStart w:id="32" w:name="_diagram"/>
+      <w:bookmarkStart w:id="29" w:name="_diagram"/>
       <w:r>
         <w:t xml:space="preserve">Diagram</w:t>
       </w:r>
-      <w:bookmarkEnd w:id="32"/>
+      <w:bookmarkEnd w:id="29"/>
     </w:p>
     <w:p>
       <w:pPr>
@@ -10644,18 +10474,18 @@
           <wp:inline>
             <wp:extent cx="9720000" cy="4078928"/>
             <wp:effectExtent b="0" l="0" r="0" t="0"/>
-            <wp:docPr descr="Pipeline" title="" id="34" name="Picture"/>
+            <wp:docPr descr="Pipeline" title="" id="31" name="Picture"/>
             <a:graphic>
               <a:graphicData uri="http://schemas.openxmlformats.org/drawingml/2006/picture">
                 <pic:pic>
                   <pic:nvPicPr>
-                    <pic:cNvPr descr="diagrams/pipeline.png" id="35" name="Picture"/>
+                    <pic:cNvPr descr="diagrams/pipeline.png" id="32" name="Picture"/>
                     <pic:cNvPicPr>
                       <a:picLocks noChangeArrowheads="1" noChangeAspect="1"/>
                     </pic:cNvPicPr>
                   </pic:nvPicPr>
                   <pic:blipFill>
-                    <a:blip r:embed="rId33"/>
+                    <a:blip r:embed="rId30"/>
                     <a:stretch>
                       <a:fillRect/>
                     </a:stretch>
@@ -10718,11 +10548,11 @@
       <w:pPr>
         <w:pStyle w:val="Heading2"/>
       </w:pPr>
-      <w:bookmarkStart w:id="36" w:name="_4ff6536d3fb179ed45543c09917e315dd11e6c4"/>
+      <w:bookmarkStart w:id="33" w:name="_4ff6536d3fb179ed45543c09917e315dd11e6c4"/>
       <w:r>
         <w:t xml:space="preserve">Components and triggers</w:t>
       </w:r>
-      <w:bookmarkEnd w:id="36"/>
+      <w:bookmarkEnd w:id="33"/>
     </w:p>
     <w:tbl>
       <w:tblPr>
@@ -11717,28 +11547,28 @@
       <w:pPr>
         <w:pStyle w:val="Heading2"/>
       </w:pPr>
-      <w:bookmarkStart w:id="37" w:name="_walkthroughs"/>
+      <w:bookmarkStart w:id="34" w:name="_walkthroughs"/>
       <w:r>
         <w:t xml:space="preserve">Walkthroughs</w:t>
       </w:r>
-      <w:bookmarkEnd w:id="37"/>
+      <w:bookmarkEnd w:id="34"/>
     </w:p>
     <w:p>
       <w:pPr>
         <w:pStyle w:val="Heading3"/>
       </w:pPr>
-      <w:bookmarkStart w:id="38" w:name="_e77a1fbb8cbd66895cf6cf846783b264295ec04"/>
+      <w:bookmarkStart w:id="35" w:name="_e77a1fbb8cbd66895cf6cf846783b264295ec04"/>
       <w:r>
         <w:t xml:space="preserve">a. The S1 weekly snapshot (corrections and retractions)</w:t>
       </w:r>
-      <w:bookmarkEnd w:id="38"/>
+      <w:bookmarkEnd w:id="35"/>
     </w:p>
     <w:p>
       <w:pPr>
         <w:pStyle w:val="Compact"/>
         <w:numPr>
           <w:ilvl w:val="0"/>
-          <w:numId w:val="1005"/>
+          <w:numId w:val="1004"/>
         </w:numPr>
       </w:pPr>
       <w:r>
@@ -11786,7 +11616,7 @@
         <w:pStyle w:val="Compact"/>
         <w:numPr>
           <w:ilvl w:val="0"/>
-          <w:numId w:val="1005"/>
+          <w:numId w:val="1004"/>
         </w:numPr>
       </w:pPr>
       <w:r>
@@ -11822,7 +11652,7 @@
         <w:pStyle w:val="Compact"/>
         <w:numPr>
           <w:ilvl w:val="0"/>
-          <w:numId w:val="1005"/>
+          <w:numId w:val="1004"/>
         </w:numPr>
       </w:pPr>
       <w:r>
@@ -11834,7 +11664,7 @@
         <w:pStyle w:val="Compact"/>
         <w:numPr>
           <w:ilvl w:val="1"/>
-          <w:numId w:val="1006"/>
+          <w:numId w:val="1005"/>
         </w:numPr>
       </w:pPr>
       <w:r>
@@ -11871,7 +11701,7 @@
         <w:pStyle w:val="Compact"/>
         <w:numPr>
           <w:ilvl w:val="1"/>
-          <w:numId w:val="1006"/>
+          <w:numId w:val="1005"/>
         </w:numPr>
       </w:pPr>
       <w:r>
@@ -11899,7 +11729,7 @@
         <w:pStyle w:val="Compact"/>
         <w:numPr>
           <w:ilvl w:val="1"/>
-          <w:numId w:val="1006"/>
+          <w:numId w:val="1005"/>
         </w:numPr>
       </w:pPr>
       <w:r>
@@ -11927,7 +11757,7 @@
         <w:pStyle w:val="Compact"/>
         <w:numPr>
           <w:ilvl w:val="0"/>
-          <w:numId w:val="1005"/>
+          <w:numId w:val="1004"/>
         </w:numPr>
       </w:pPr>
       <w:r>
@@ -11954,7 +11784,7 @@
         <w:pStyle w:val="Compact"/>
         <w:numPr>
           <w:ilvl w:val="0"/>
-          <w:numId w:val="1005"/>
+          <w:numId w:val="1004"/>
         </w:numPr>
       </w:pPr>
       <w:r>
@@ -11977,11 +11807,11 @@
       <w:pPr>
         <w:pStyle w:val="Heading3"/>
       </w:pPr>
-      <w:bookmarkStart w:id="39" w:name="_7d1b76e018cf3419e042eead3128e91b930648a"/>
+      <w:bookmarkStart w:id="36" w:name="_7d1b76e018cf3419e042eead3128e91b930648a"/>
       <w:r>
         <w:t xml:space="preserve">b. The four S4 events, in arrival order</w:t>
       </w:r>
-      <w:bookmarkEnd w:id="39"/>
+      <w:bookmarkEnd w:id="36"/>
     </w:p>
     <w:tbl>
       <w:tblPr>
@@ -12345,11 +12175,304 @@
       <w:pPr>
         <w:pStyle w:val="Heading3"/>
       </w:pPr>
-      <w:bookmarkStart w:id="40" w:name="_a94c93838125ef978f7b4e2b6839029937e9069"/>
+      <w:bookmarkStart w:id="37" w:name="_a94c93838125ef978f7b4e2b6839029937e9069"/>
       <w:r>
         <w:t xml:space="preserve">c. A new S3 warning letter</w:t>
       </w:r>
-      <w:bookmarkEnd w:id="40"/>
+      <w:bookmarkEnd w:id="37"/>
+    </w:p>
+    <w:p>
+      <w:pPr>
+        <w:pStyle w:val="Compact"/>
+        <w:numPr>
+          <w:ilvl w:val="0"/>
+          <w:numId w:val="1006"/>
+        </w:numPr>
+      </w:pPr>
+      <w:r>
+        <w:rPr>
+          <w:rStyle w:val="VerbatimChar"/>
+        </w:rPr>
+        <w:t xml:space="preserve">WL-320-26-118.json</w:t>
+      </w:r>
+      <w:r>
+        <w:t xml:space="preserve"> </w:t>
+      </w:r>
+      <w:r>
+        <w:t xml:space="preserve">+ text land in S3.</w:t>
+      </w:r>
+      <w:r>
+        <w:t xml:space="preserve"> </w:t>
+      </w:r>
+      <w:r>
+        <w:rPr>
+          <w:rStyle w:val="VerbatimChar"/>
+        </w:rPr>
+        <w:t xml:space="preserve">ObjectCreated</w:t>
+      </w:r>
+      <w:r>
+        <w:t xml:space="preserve"> </w:t>
+      </w:r>
+      <w:r>
+        <w:t xml:space="preserve">→ SQS → Lambda</w:t>
+      </w:r>
+      <w:r>
+        <w:t xml:space="preserve"> </w:t>
+      </w:r>
+      <w:r>
+        <w:t xml:space="preserve">“letter”</w:t>
+      </w:r>
+      <w:r>
+        <w:t xml:space="preserve">.</w:t>
+      </w:r>
+    </w:p>
+    <w:p>
+      <w:pPr>
+        <w:pStyle w:val="Compact"/>
+        <w:numPr>
+          <w:ilvl w:val="0"/>
+          <w:numId w:val="1006"/>
+        </w:numPr>
+      </w:pPr>
+      <w:r>
+        <w:t xml:space="preserve">Metadata →</w:t>
+      </w:r>
+      <w:r>
+        <w:t xml:space="preserve"> </w:t>
+      </w:r>
+      <w:r>
+        <w:rPr>
+          <w:rStyle w:val="VerbatimChar"/>
+        </w:rPr>
+        <w:t xml:space="preserve">fact_warning_letter</w:t>
+      </w:r>
+      <w:r>
+        <w:t xml:space="preserve"> </w:t>
+      </w:r>
+      <w:r>
+        <w:t xml:space="preserve">(</w:t>
+      </w:r>
+      <w:r>
+        <w:rPr>
+          <w:rStyle w:val="VerbatimChar"/>
+        </w:rPr>
+        <w:t xml:space="preserve">nlp_status = PENDING</w:t>
+      </w:r>
+      <w:r>
+        <w:t xml:space="preserve">,</w:t>
+      </w:r>
+      <w:r>
+        <w:t xml:space="preserve"> </w:t>
+      </w:r>
+      <w:r>
+        <w:rPr>
+          <w:rStyle w:val="VerbatimChar"/>
+        </w:rPr>
+        <w:t xml:space="preserve">fei_number</w:t>
+      </w:r>
+      <w:r>
+        <w:t xml:space="preserve"> </w:t>
+      </w:r>
+      <w:r>
+        <w:t xml:space="preserve">null); body →</w:t>
+      </w:r>
+      <w:r>
+        <w:t xml:space="preserve"> </w:t>
+      </w:r>
+      <w:r>
+        <w:rPr>
+          <w:rStyle w:val="VerbatimChar"/>
+        </w:rPr>
+        <w:t xml:space="preserve">s3://raw/s3/…/WL-320-26-118.txt</w:t>
+      </w:r>
+      <w:r>
+        <w:t xml:space="preserve">.</w:t>
+      </w:r>
+    </w:p>
+    <w:p>
+      <w:pPr>
+        <w:pStyle w:val="Compact"/>
+        <w:numPr>
+          <w:ilvl w:val="0"/>
+          <w:numId w:val="1006"/>
+        </w:numPr>
+      </w:pPr>
+      <w:r>
+        <w:t xml:space="preserve">ER on recipient name + address: tokens</w:t>
+      </w:r>
+      <w:r>
+        <w:t xml:space="preserve"> </w:t>
+      </w:r>
+      <w:r>
+        <w:rPr>
+          <w:rStyle w:val="VerbatimChar"/>
+        </w:rPr>
+        <w:t xml:space="preserve">plot 14</w:t>
+      </w:r>
+      <w:r>
+        <w:t xml:space="preserve">,</w:t>
+      </w:r>
+      <w:r>
+        <w:t xml:space="preserve"> </w:t>
+      </w:r>
+      <w:r>
+        <w:rPr>
+          <w:rStyle w:val="VerbatimChar"/>
+        </w:rPr>
+        <w:t xml:space="preserve">pashamylaram</w:t>
+      </w:r>
+      <w:r>
+        <w:t xml:space="preserve"> </w:t>
+      </w:r>
+      <w:r>
+        <w:t xml:space="preserve">block against S-001; address similarity 0.93, name 0.85, no unit mismatch → 0.91 →</w:t>
+      </w:r>
+      <w:r>
+        <w:t xml:space="preserve"> </w:t>
+      </w:r>
+      <w:r>
+        <w:rPr>
+          <w:b/>
+          <w:bCs/>
+        </w:rPr>
+        <w:t xml:space="preserve">review band</w:t>
+      </w:r>
+      <w:r>
+        <w:t xml:space="preserve">. Review item opened. The letter is indexed in OpenSearch immediately with</w:t>
+      </w:r>
+      <w:r>
+        <w:t xml:space="preserve"> </w:t>
+      </w:r>
+      <w:r>
+        <w:rPr>
+          <w:rStyle w:val="VerbatimChar"/>
+        </w:rPr>
+        <w:t xml:space="preserve">site_key = null</w:t>
+      </w:r>
+      <w:r>
+        <w:t xml:space="preserve">, so it is already findable by text (U5 met).</w:t>
+      </w:r>
+    </w:p>
+    <w:p>
+      <w:pPr>
+        <w:pStyle w:val="Compact"/>
+        <w:numPr>
+          <w:ilvl w:val="0"/>
+          <w:numId w:val="1006"/>
+        </w:numPr>
+      </w:pPr>
+      <w:r>
+        <w:t xml:space="preserve">Message to the NLP queue. Lambda</w:t>
+      </w:r>
+      <w:r>
+        <w:t xml:space="preserve"> </w:t>
+      </w:r>
+      <w:r>
+        <w:t xml:space="preserve">“nlp”</w:t>
+      </w:r>
+      <w:r>
+        <w:t xml:space="preserve"> </w:t>
+      </w:r>
+      <w:r>
+        <w:t xml:space="preserve">(≤ 5 concurrent → ≤ 5 rps) calls the API; on the 2% failure, backoff and retry up to 5 times, then DLQ + metric. On success:</w:t>
+      </w:r>
+      <w:r>
+        <w:t xml:space="preserve"> </w:t>
+      </w:r>
+      <w:r>
+        <w:rPr>
+          <w:rStyle w:val="VerbatimChar"/>
+        </w:rPr>
+        <w:t xml:space="preserve">fact_letter_tag</w:t>
+      </w:r>
+      <w:r>
+        <w:t xml:space="preserve"> </w:t>
+      </w:r>
+      <w:r>
+        <w:t xml:space="preserve">rows,</w:t>
+      </w:r>
+      <w:r>
+        <w:t xml:space="preserve"> </w:t>
+      </w:r>
+      <w:r>
+        <w:rPr>
+          <w:rStyle w:val="VerbatimChar"/>
+        </w:rPr>
+        <w:t xml:space="preserve">nlp_status = DONE</w:t>
+      </w:r>
+      <w:r>
+        <w:t xml:space="preserve">, OpenSearch document patched with tags.</w:t>
+      </w:r>
+    </w:p>
+    <w:p>
+      <w:pPr>
+        <w:pStyle w:val="Compact"/>
+        <w:numPr>
+          <w:ilvl w:val="0"/>
+          <w:numId w:val="1006"/>
+        </w:numPr>
+      </w:pPr>
+      <w:r>
+        <w:t xml:space="preserve">A steward confirms S-001 (the EU record has the same plot). Bridge row</w:t>
+      </w:r>
+      <w:r>
+        <w:t xml:space="preserve"> </w:t>
+      </w:r>
+      <w:r>
+        <w:rPr>
+          <w:rStyle w:val="VerbatimChar"/>
+        </w:rPr>
+        <w:t xml:space="preserve">LETTER_ID → S-001</w:t>
+      </w:r>
+      <w:r>
+        <w:t xml:space="preserve"> </w:t>
+      </w:r>
+      <w:r>
+        <w:t xml:space="preserve">(</w:t>
+      </w:r>
+      <w:r>
+        <w:rPr>
+          <w:rStyle w:val="VerbatimChar"/>
+        </w:rPr>
+        <w:t xml:space="preserve">STEWARD</w:t>
+      </w:r>
+      <w:r>
+        <w:t xml:space="preserve">,</w:t>
+      </w:r>
+      <w:r>
+        <w:t xml:space="preserve"> </w:t>
+      </w:r>
+      <w:r>
+        <w:rPr>
+          <w:rStyle w:val="VerbatimChar"/>
+        </w:rPr>
+        <w:t xml:space="preserve">decision_group_id</w:t>
+      </w:r>
+      <w:r>
+        <w:t xml:space="preserve">). Outbox → publish: the document gets</w:t>
+      </w:r>
+      <w:r>
+        <w:t xml:space="preserve"> </w:t>
+      </w:r>
+      <w:r>
+        <w:rPr>
+          <w:rStyle w:val="VerbatimChar"/>
+        </w:rPr>
+        <w:t xml:space="preserve">site_key</w:t>
+      </w:r>
+      <w:r>
+        <w:t xml:space="preserve">; the profile page shows the letter.</w:t>
+      </w:r>
+    </w:p>
+    <w:p>
+      <w:pPr>
+        <w:pStyle w:val="Heading3"/>
+      </w:pPr>
+      <w:bookmarkStart w:id="38" w:name="_358f456af0bfc39c92bdfbc08ca513ade6ee64d"/>
+      <w:r>
+        <w:t xml:space="preserve">d. An S5 watchlist delete</w:t>
+      </w:r>
+      <w:bookmarkEnd w:id="38"/>
     </w:p>
     <w:p>
       <w:pPr>
@@ -12360,37 +12483,16 @@
         </w:numPr>
       </w:pPr>
       <w:r>
+        <w:t xml:space="preserve">The customer removes SUP-0071. Debezium emits</w:t>
+      </w:r>
+      <w:r>
+        <w:t xml:space="preserve"> </w:t>
+      </w:r>
+      <w:r>
         <w:rPr>
           <w:rStyle w:val="VerbatimChar"/>
         </w:rPr>
-        <w:t xml:space="preserve">WL-320-26-118.json</w:t>
-      </w:r>
-      <w:r>
-        <w:t xml:space="preserve"> </w:t>
-      </w:r>
-      <w:r>
-        <w:t xml:space="preserve">+ text land in S3.</w:t>
-      </w:r>
-      <w:r>
-        <w:t xml:space="preserve"> </w:t>
-      </w:r>
-      <w:r>
-        <w:rPr>
-          <w:rStyle w:val="VerbatimChar"/>
-        </w:rPr>
-        <w:t xml:space="preserve">ObjectCreated</w:t>
-      </w:r>
-      <w:r>
-        <w:t xml:space="preserve"> </w:t>
-      </w:r>
-      <w:r>
-        <w:t xml:space="preserve">→ SQS → Lambda</w:t>
-      </w:r>
-      <w:r>
-        <w:t xml:space="preserve"> </w:t>
-      </w:r>
-      <w:r>
-        <w:t xml:space="preserve">“letter”</w:t>
+        <w:t xml:space="preserve">{"op":"d", "before": {"watch_id": 9912, "customer_id": "cust_042", …}, "ts_ms": …}</w:t>
       </w:r>
       <w:r>
         <w:t xml:space="preserve">.</w:t>
@@ -12405,7 +12507,16 @@
         </w:numPr>
       </w:pPr>
       <w:r>
-        <w:t xml:space="preserve">Metadata →</w:t>
+        <w:t xml:space="preserve">Lambda</w:t>
+      </w:r>
+      <w:r>
+        <w:t xml:space="preserve"> </w:t>
+      </w:r>
+      <w:r>
+        <w:t xml:space="preserve">“s5-apply”</w:t>
+      </w:r>
+      <w:r>
+        <w:t xml:space="preserve">: if</w:t>
       </w:r>
       <w:r>
         <w:t xml:space="preserve"> </w:t>
@@ -12414,22 +12525,25 @@
         <w:rPr>
           <w:rStyle w:val="VerbatimChar"/>
         </w:rPr>
-        <w:t xml:space="preserve">fact_warning_letter</w:t>
-      </w:r>
-      <w:r>
-        <w:t xml:space="preserve"> </w:t>
-      </w:r>
-      <w:r>
-        <w:t xml:space="preserve">(</w:t>
+        <w:t xml:space="preserve">ts_ms</w:t>
+      </w:r>
+      <w:r>
+        <w:t xml:space="preserve"> </w:t>
+      </w:r>
+      <w:r>
+        <w:t xml:space="preserve">is older than the applied</w:t>
+      </w:r>
+      <w:r>
+        <w:t xml:space="preserve"> </w:t>
       </w:r>
       <w:r>
         <w:rPr>
           <w:rStyle w:val="VerbatimChar"/>
         </w:rPr>
-        <w:t xml:space="preserve">nlp_status = PENDING</w:t>
-      </w:r>
-      <w:r>
-        <w:t xml:space="preserve">,</w:t>
+        <w:t xml:space="preserve">cdc_timestamp</w:t>
+      </w:r>
+      <w:r>
+        <w:t xml:space="preserve">, ignore. Otherwise close the current version and open one with</w:t>
       </w:r>
       <w:r>
         <w:t xml:space="preserve"> </w:t>
@@ -12438,22 +12552,7 @@
         <w:rPr>
           <w:rStyle w:val="VerbatimChar"/>
         </w:rPr>
-        <w:t xml:space="preserve">fei_number</w:t>
-      </w:r>
-      <w:r>
-        <w:t xml:space="preserve"> </w:t>
-      </w:r>
-      <w:r>
-        <w:t xml:space="preserve">null); body →</w:t>
-      </w:r>
-      <w:r>
-        <w:t xml:space="preserve"> </w:t>
-      </w:r>
-      <w:r>
-        <w:rPr>
-          <w:rStyle w:val="VerbatimChar"/>
-        </w:rPr>
-        <w:t xml:space="preserve">s3://raw/s3/…/WL-320-26-118.txt</w:t>
+        <w:t xml:space="preserve">is_active = false</w:t>
       </w:r>
       <w:r>
         <w:t xml:space="preserve">.</w:t>
@@ -12468,47 +12567,11 @@
         </w:numPr>
       </w:pPr>
       <w:r>
-        <w:t xml:space="preserve">ER on recipient name + address: tokens</w:t>
-      </w:r>
-      <w:r>
-        <w:t xml:space="preserve"> </w:t>
-      </w:r>
-      <w:r>
-        <w:rPr>
-          <w:rStyle w:val="VerbatimChar"/>
-        </w:rPr>
-        <w:t xml:space="preserve">plot 14</w:t>
-      </w:r>
-      <w:r>
-        <w:t xml:space="preserve">,</w:t>
-      </w:r>
-      <w:r>
-        <w:t xml:space="preserve"> </w:t>
-      </w:r>
-      <w:r>
-        <w:rPr>
-          <w:rStyle w:val="VerbatimChar"/>
-        </w:rPr>
-        <w:t xml:space="preserve">pashamylaram</w:t>
-      </w:r>
-      <w:r>
-        <w:t xml:space="preserve"> </w:t>
-      </w:r>
-      <w:r>
-        <w:t xml:space="preserve">block against S-001; address similarity 0.93, name 0.85, no unit mismatch → 0.91 →</w:t>
-      </w:r>
-      <w:r>
-        <w:t xml:space="preserve"> </w:t>
-      </w:r>
-      <w:r>
         <w:rPr>
           <w:b/>
           <w:bCs/>
         </w:rPr>
-        <w:t xml:space="preserve">review band</w:t>
-      </w:r>
-      <w:r>
-        <w:t xml:space="preserve">. Review item opened. The letter is indexed in OpenSearch immediately with</w:t>
+        <w:t xml:space="preserve">Same invocation:</w:t>
       </w:r>
       <w:r>
         <w:t xml:space="preserve"> </w:t>
@@ -12517,10 +12580,37 @@
         <w:rPr>
           <w:rStyle w:val="VerbatimChar"/>
         </w:rPr>
-        <w:t xml:space="preserve">site_key = null</w:t>
-      </w:r>
-      <w:r>
-        <w:t xml:space="preserve">, so it is already findable by text (U5 met).</w:t>
+        <w:t xml:space="preserve">DeleteItem</w:t>
+      </w:r>
+      <w:r>
+        <w:t xml:space="preserve"> </w:t>
+      </w:r>
+      <w:r>
+        <w:t xml:space="preserve">on DynamoDB</w:t>
+      </w:r>
+      <w:r>
+        <w:t xml:space="preserve"> </w:t>
+      </w:r>
+      <w:r>
+        <w:rPr>
+          <w:rStyle w:val="VerbatimChar"/>
+        </w:rPr>
+        <w:t xml:space="preserve">site_watchers (S-001, 9912)</w:t>
+      </w:r>
+      <w:r>
+        <w:t xml:space="preserve">. From this moment any S4 event for S-001 finds no watcher for cust_042. This is the</w:t>
+      </w:r>
+      <w:r>
+        <w:t xml:space="preserve"> </w:t>
+      </w:r>
+      <w:r>
+        <w:t xml:space="preserve">“immediately”</w:t>
+      </w:r>
+      <w:r>
+        <w:t xml:space="preserve"> </w:t>
+      </w:r>
+      <w:r>
+        <w:t xml:space="preserve">in the brief: it does not wait for the outbox.</w:t>
       </w:r>
     </w:p>
     <w:p>
@@ -12532,266 +12622,6 @@
         </w:numPr>
       </w:pPr>
       <w:r>
-        <w:t xml:space="preserve">Message to the NLP queue. Lambda</w:t>
-      </w:r>
-      <w:r>
-        <w:t xml:space="preserve"> </w:t>
-      </w:r>
-      <w:r>
-        <w:t xml:space="preserve">“nlp”</w:t>
-      </w:r>
-      <w:r>
-        <w:t xml:space="preserve"> </w:t>
-      </w:r>
-      <w:r>
-        <w:t xml:space="preserve">(≤ 5 concurrent → ≤ 5 rps) calls the API; on the 2% failure, backoff and retry up to 5 times, then DLQ + metric. On success:</w:t>
-      </w:r>
-      <w:r>
-        <w:t xml:space="preserve"> </w:t>
-      </w:r>
-      <w:r>
-        <w:rPr>
-          <w:rStyle w:val="VerbatimChar"/>
-        </w:rPr>
-        <w:t xml:space="preserve">fact_letter_tag</w:t>
-      </w:r>
-      <w:r>
-        <w:t xml:space="preserve"> </w:t>
-      </w:r>
-      <w:r>
-        <w:t xml:space="preserve">rows,</w:t>
-      </w:r>
-      <w:r>
-        <w:t xml:space="preserve"> </w:t>
-      </w:r>
-      <w:r>
-        <w:rPr>
-          <w:rStyle w:val="VerbatimChar"/>
-        </w:rPr>
-        <w:t xml:space="preserve">nlp_status = DONE</w:t>
-      </w:r>
-      <w:r>
-        <w:t xml:space="preserve">, OpenSearch document patched with tags.</w:t>
-      </w:r>
-    </w:p>
-    <w:p>
-      <w:pPr>
-        <w:pStyle w:val="Compact"/>
-        <w:numPr>
-          <w:ilvl w:val="0"/>
-          <w:numId w:val="1007"/>
-        </w:numPr>
-      </w:pPr>
-      <w:r>
-        <w:t xml:space="preserve">A steward confirms S-001 (the EU record has the same plot). Bridge row</w:t>
-      </w:r>
-      <w:r>
-        <w:t xml:space="preserve"> </w:t>
-      </w:r>
-      <w:r>
-        <w:rPr>
-          <w:rStyle w:val="VerbatimChar"/>
-        </w:rPr>
-        <w:t xml:space="preserve">LETTER_ID → S-001</w:t>
-      </w:r>
-      <w:r>
-        <w:t xml:space="preserve"> </w:t>
-      </w:r>
-      <w:r>
-        <w:t xml:space="preserve">(</w:t>
-      </w:r>
-      <w:r>
-        <w:rPr>
-          <w:rStyle w:val="VerbatimChar"/>
-        </w:rPr>
-        <w:t xml:space="preserve">STEWARD</w:t>
-      </w:r>
-      <w:r>
-        <w:t xml:space="preserve">,</w:t>
-      </w:r>
-      <w:r>
-        <w:t xml:space="preserve"> </w:t>
-      </w:r>
-      <w:r>
-        <w:rPr>
-          <w:rStyle w:val="VerbatimChar"/>
-        </w:rPr>
-        <w:t xml:space="preserve">decision_group_id</w:t>
-      </w:r>
-      <w:r>
-        <w:t xml:space="preserve">). Outbox → publish: the document gets</w:t>
-      </w:r>
-      <w:r>
-        <w:t xml:space="preserve"> </w:t>
-      </w:r>
-      <w:r>
-        <w:rPr>
-          <w:rStyle w:val="VerbatimChar"/>
-        </w:rPr>
-        <w:t xml:space="preserve">site_key</w:t>
-      </w:r>
-      <w:r>
-        <w:t xml:space="preserve">; the profile page shows the letter.</w:t>
-      </w:r>
-    </w:p>
-    <w:p>
-      <w:pPr>
-        <w:pStyle w:val="Heading3"/>
-      </w:pPr>
-      <w:bookmarkStart w:id="41" w:name="_358f456af0bfc39c92bdfbc08ca513ade6ee64d"/>
-      <w:r>
-        <w:t xml:space="preserve">d. An S5 watchlist delete</w:t>
-      </w:r>
-      <w:bookmarkEnd w:id="41"/>
-    </w:p>
-    <w:p>
-      <w:pPr>
-        <w:pStyle w:val="Compact"/>
-        <w:numPr>
-          <w:ilvl w:val="0"/>
-          <w:numId w:val="1008"/>
-        </w:numPr>
-      </w:pPr>
-      <w:r>
-        <w:t xml:space="preserve">The customer removes SUP-0071. Debezium emits</w:t>
-      </w:r>
-      <w:r>
-        <w:t xml:space="preserve"> </w:t>
-      </w:r>
-      <w:r>
-        <w:rPr>
-          <w:rStyle w:val="VerbatimChar"/>
-        </w:rPr>
-        <w:t xml:space="preserve">{"op":"d", "before": {"watch_id": 9912, "customer_id": "cust_042", …}, "ts_ms": …}</w:t>
-      </w:r>
-      <w:r>
-        <w:t xml:space="preserve">.</w:t>
-      </w:r>
-    </w:p>
-    <w:p>
-      <w:pPr>
-        <w:pStyle w:val="Compact"/>
-        <w:numPr>
-          <w:ilvl w:val="0"/>
-          <w:numId w:val="1008"/>
-        </w:numPr>
-      </w:pPr>
-      <w:r>
-        <w:t xml:space="preserve">Lambda</w:t>
-      </w:r>
-      <w:r>
-        <w:t xml:space="preserve"> </w:t>
-      </w:r>
-      <w:r>
-        <w:t xml:space="preserve">“s5-apply”</w:t>
-      </w:r>
-      <w:r>
-        <w:t xml:space="preserve">: if</w:t>
-      </w:r>
-      <w:r>
-        <w:t xml:space="preserve"> </w:t>
-      </w:r>
-      <w:r>
-        <w:rPr>
-          <w:rStyle w:val="VerbatimChar"/>
-        </w:rPr>
-        <w:t xml:space="preserve">ts_ms</w:t>
-      </w:r>
-      <w:r>
-        <w:t xml:space="preserve"> </w:t>
-      </w:r>
-      <w:r>
-        <w:t xml:space="preserve">is older than the applied</w:t>
-      </w:r>
-      <w:r>
-        <w:t xml:space="preserve"> </w:t>
-      </w:r>
-      <w:r>
-        <w:rPr>
-          <w:rStyle w:val="VerbatimChar"/>
-        </w:rPr>
-        <w:t xml:space="preserve">cdc_timestamp</w:t>
-      </w:r>
-      <w:r>
-        <w:t xml:space="preserve">, ignore. Otherwise close the current version and open one with</w:t>
-      </w:r>
-      <w:r>
-        <w:t xml:space="preserve"> </w:t>
-      </w:r>
-      <w:r>
-        <w:rPr>
-          <w:rStyle w:val="VerbatimChar"/>
-        </w:rPr>
-        <w:t xml:space="preserve">is_active = false</w:t>
-      </w:r>
-      <w:r>
-        <w:t xml:space="preserve">.</w:t>
-      </w:r>
-    </w:p>
-    <w:p>
-      <w:pPr>
-        <w:pStyle w:val="Compact"/>
-        <w:numPr>
-          <w:ilvl w:val="0"/>
-          <w:numId w:val="1008"/>
-        </w:numPr>
-      </w:pPr>
-      <w:r>
-        <w:rPr>
-          <w:b/>
-          <w:bCs/>
-        </w:rPr>
-        <w:t xml:space="preserve">Same invocation:</w:t>
-      </w:r>
-      <w:r>
-        <w:t xml:space="preserve"> </w:t>
-      </w:r>
-      <w:r>
-        <w:rPr>
-          <w:rStyle w:val="VerbatimChar"/>
-        </w:rPr>
-        <w:t xml:space="preserve">DeleteItem</w:t>
-      </w:r>
-      <w:r>
-        <w:t xml:space="preserve"> </w:t>
-      </w:r>
-      <w:r>
-        <w:t xml:space="preserve">on DynamoDB</w:t>
-      </w:r>
-      <w:r>
-        <w:t xml:space="preserve"> </w:t>
-      </w:r>
-      <w:r>
-        <w:rPr>
-          <w:rStyle w:val="VerbatimChar"/>
-        </w:rPr>
-        <w:t xml:space="preserve">site_watchers (S-001, 9912)</w:t>
-      </w:r>
-      <w:r>
-        <w:t xml:space="preserve">. From this moment any S4 event for S-001 finds no watcher for cust_042. This is the</w:t>
-      </w:r>
-      <w:r>
-        <w:t xml:space="preserve"> </w:t>
-      </w:r>
-      <w:r>
-        <w:t xml:space="preserve">“immediately”</w:t>
-      </w:r>
-      <w:r>
-        <w:t xml:space="preserve"> </w:t>
-      </w:r>
-      <w:r>
-        <w:t xml:space="preserve">in the brief: it does not wait for the outbox.</w:t>
-      </w:r>
-    </w:p>
-    <w:p>
-      <w:pPr>
-        <w:pStyle w:val="Compact"/>
-        <w:numPr>
-          <w:ilvl w:val="0"/>
-          <w:numId w:val="1008"/>
-        </w:numPr>
-      </w:pPr>
-      <w:r>
         <w:t xml:space="preserve">The bridge row</w:t>
       </w:r>
       <w:r>
@@ -12828,21 +12658,21 @@
       <w:pPr>
         <w:pStyle w:val="Heading1"/>
       </w:pPr>
-      <w:bookmarkStart w:id="42" w:name="_f0b3c50ff5029ee5f7258b7c6a65e7d0dea5495"/>
+      <w:bookmarkStart w:id="39" w:name="_f0b3c50ff5029ee5f7258b7c6a65e7d0dea5495"/>
       <w:r>
         <w:t xml:space="preserve">Part D — Pipeline rationale</w:t>
       </w:r>
-      <w:bookmarkEnd w:id="42"/>
+      <w:bookmarkEnd w:id="39"/>
     </w:p>
     <w:p>
       <w:pPr>
         <w:pStyle w:val="Heading2"/>
       </w:pPr>
-      <w:bookmarkStart w:id="43" w:name="_f0745c3d1c4022d5d540818a18a81b9e96eebff"/>
+      <w:bookmarkStart w:id="40" w:name="_f0745c3d1c4022d5d540818a18a81b9e96eebff"/>
       <w:r>
         <w:t xml:space="preserve">1. Batch and streaming: split by source, unified by store</w:t>
       </w:r>
-      <w:bookmarkEnd w:id="43"/>
+      <w:bookmarkEnd w:id="40"/>
     </w:p>
     <w:p>
       <w:pPr>
@@ -12918,11 +12748,11 @@
       <w:pPr>
         <w:pStyle w:val="Heading2"/>
       </w:pPr>
-      <w:bookmarkStart w:id="44" w:name="_ba4ca068f9f2278321cf9fea3035a5a0212e00c"/>
+      <w:bookmarkStart w:id="41" w:name="_ba4ca068f9f2278321cf9fea3035a5a0212e00c"/>
       <w:r>
         <w:t xml:space="preserve">2. Correctness under duplicates, disorder, late data, schema change</w:t>
       </w:r>
-      <w:bookmarkEnd w:id="44"/>
+      <w:bookmarkEnd w:id="41"/>
     </w:p>
     <w:tbl>
       <w:tblPr>
@@ -13367,11 +13197,11 @@
       <w:pPr>
         <w:pStyle w:val="Heading2"/>
       </w:pPr>
-      <w:bookmarkStart w:id="45" w:name="_fb02abff04cfcbef03378580a607d4db5648cf4"/>
+      <w:bookmarkStart w:id="42" w:name="_fb02abff04cfcbef03378580a607d4db5648cf4"/>
       <w:r>
         <w:t xml:space="preserve">3. Reprocessing and backfill</w:t>
       </w:r>
-      <w:bookmarkEnd w:id="45"/>
+      <w:bookmarkEnd w:id="42"/>
     </w:p>
     <w:p>
       <w:pPr>
@@ -13485,9 +13315,810 @@
       <w:pPr>
         <w:pStyle w:val="Heading2"/>
       </w:pPr>
-      <w:bookmarkStart w:id="46" w:name="_c425f7133e41882dd94f4839905930029452f17"/>
+      <w:bookmarkStart w:id="43" w:name="_c425f7133e41882dd94f4839905930029452f17"/>
       <w:r>
         <w:t xml:space="preserve">4. Data quality</w:t>
+      </w:r>
+      <w:bookmarkEnd w:id="43"/>
+    </w:p>
+    <w:tbl>
+      <w:tblPr>
+        <w:tblStyle w:val="Table"/>
+        <w:tblW w:type="pct" w:w="5000"/>
+        <w:tblLayout w:type="fixed"/>
+        <w:tblLook w:firstRow="1" w:lastRow="0" w:firstColumn="0" w:lastColumn="0" w:noHBand="0" w:noVBand="0" w:val="0020"/>
+      </w:tblPr>
+      <w:tblGrid>
+        <w:gridCol w:w="2640"/>
+        <w:gridCol w:w="2640"/>
+        <w:gridCol w:w="2640"/>
+      </w:tblGrid>
+      <w:tr>
+        <w:trPr>
+          <w:tblHeader w:val="on"/>
+        </w:trPr>
+        <w:tc>
+          <w:tcPr/>
+          <w:p>
+            <w:pPr>
+              <w:pStyle w:val="Compact"/>
+            </w:pPr>
+            <w:r>
+              <w:t xml:space="preserve">Layer</w:t>
+            </w:r>
+          </w:p>
+        </w:tc>
+        <w:tc>
+          <w:tcPr/>
+          <w:p>
+            <w:pPr>
+              <w:pStyle w:val="Compact"/>
+            </w:pPr>
+            <w:r>
+              <w:t xml:space="preserve">Checks</w:t>
+            </w:r>
+          </w:p>
+        </w:tc>
+        <w:tc>
+          <w:tcPr/>
+          <w:p>
+            <w:pPr>
+              <w:pStyle w:val="Compact"/>
+            </w:pPr>
+            <w:r>
+              <w:t xml:space="preserve">On failure</w:t>
+            </w:r>
+          </w:p>
+        </w:tc>
+      </w:tr>
+      <w:tr>
+        <w:tc>
+          <w:tcPr/>
+          <w:p>
+            <w:pPr>
+              <w:pStyle w:val="Compact"/>
+            </w:pPr>
+            <w:r>
+              <w:t xml:space="preserve">Raw</w:t>
+            </w:r>
+          </w:p>
+        </w:tc>
+        <w:tc>
+          <w:tcPr/>
+          <w:p>
+            <w:pPr>
+              <w:pStyle w:val="Compact"/>
+            </w:pPr>
+            <w:r>
+              <w:t xml:space="preserve">File present, non-empty, parseable, expected columns</w:t>
+            </w:r>
+          </w:p>
+        </w:tc>
+        <w:tc>
+          <w:tcPr/>
+          <w:p>
+            <w:pPr>
+              <w:pStyle w:val="Compact"/>
+            </w:pPr>
+            <w:r>
+              <w:t xml:space="preserve">Batch</w:t>
+            </w:r>
+            <w:r>
+              <w:t xml:space="preserve"> </w:t>
+            </w:r>
+            <w:r>
+              <w:rPr>
+                <w:rStyle w:val="VerbatimChar"/>
+              </w:rPr>
+              <w:t xml:space="preserve">FAILED</w:t>
+            </w:r>
+            <w:r>
+              <w:t xml:space="preserve">; page on-call; nothing downstream runs</w:t>
+            </w:r>
+          </w:p>
+        </w:tc>
+      </w:tr>
+      <w:tr>
+        <w:tc>
+          <w:tcPr/>
+          <w:p>
+            <w:pPr>
+              <w:pStyle w:val="Compact"/>
+            </w:pPr>
+            <w:r>
+              <w:t xml:space="preserve">Parse</w:t>
+            </w:r>
+          </w:p>
+        </w:tc>
+        <w:tc>
+          <w:tcPr/>
+          <w:p>
+            <w:pPr>
+              <w:pStyle w:val="Compact"/>
+            </w:pPr>
+            <w:r>
+              <w:t xml:space="preserve">Date-parse failures &lt; 0.5%; country mapping failures = 0; duplicate keys; null-FEI rate vs baseline</w:t>
+            </w:r>
+          </w:p>
+        </w:tc>
+        <w:tc>
+          <w:tcPr/>
+          <w:p>
+            <w:pPr>
+              <w:pStyle w:val="Compact"/>
+            </w:pPr>
+            <w:r>
+              <w:rPr>
+                <w:rStyle w:val="VerbatimChar"/>
+              </w:rPr>
+              <w:t xml:space="preserve">QUARANTINED</w:t>
+            </w:r>
+            <w:r>
+              <w:t xml:space="preserve">; last good load stays live; rejects written to a side table</w:t>
+            </w:r>
+          </w:p>
+        </w:tc>
+      </w:tr>
+      <w:tr>
+        <w:tc>
+          <w:tcPr/>
+          <w:p>
+            <w:pPr>
+              <w:pStyle w:val="Compact"/>
+            </w:pPr>
+            <w:r>
+              <w:t xml:space="preserve">Diff</w:t>
+            </w:r>
+          </w:p>
+        </w:tc>
+        <w:tc>
+          <w:tcPr/>
+          <w:p>
+            <w:pPr>
+              <w:pStyle w:val="Compact"/>
+            </w:pPr>
+            <w:r>
+              <w:t xml:space="preserve">Row count ±20% of last snapshot;</w:t>
+            </w:r>
+            <w:r>
+              <w:t xml:space="preserve"> </w:t>
+            </w:r>
+            <w:r>
+              <w:rPr>
+                <w:b/>
+                <w:bCs/>
+              </w:rPr>
+              <w:t xml:space="preserve">retraction rate &lt; 2%</w:t>
+            </w:r>
+            <w:r>
+              <w:t xml:space="preserve">; classification mix vs baseline</w:t>
+            </w:r>
+          </w:p>
+        </w:tc>
+        <w:tc>
+          <w:tcPr/>
+          <w:p>
+            <w:pPr>
+              <w:pStyle w:val="Compact"/>
+            </w:pPr>
+            <w:r>
+              <w:rPr>
+                <w:rStyle w:val="VerbatimChar"/>
+              </w:rPr>
+              <w:t xml:space="preserve">QUARANTINED</w:t>
+            </w:r>
+            <w:r>
+              <w:t xml:space="preserve">. A 30% retraction rate is a truncated file, not 75k real retractions. The single most important check</w:t>
+            </w:r>
+          </w:p>
+        </w:tc>
+      </w:tr>
+      <w:tr>
+        <w:tc>
+          <w:tcPr/>
+          <w:p>
+            <w:pPr>
+              <w:pStyle w:val="Compact"/>
+            </w:pPr>
+            <w:r>
+              <w:t xml:space="preserve">ER</w:t>
+            </w:r>
+          </w:p>
+        </w:tc>
+        <w:tc>
+          <w:tcPr/>
+          <w:p>
+            <w:pPr>
+              <w:pStyle w:val="Compact"/>
+            </w:pPr>
+            <w:r>
+              <w:t xml:space="preserve">New-site rate, auto-link rate, review-queue growth vs rolling baseline</w:t>
+            </w:r>
+          </w:p>
+        </w:tc>
+        <w:tc>
+          <w:tcPr/>
+          <w:p>
+            <w:pPr>
+              <w:pStyle w:val="Compact"/>
+            </w:pPr>
+            <w:r>
+              <w:t xml:space="preserve">Warn; large shifts usually mean a normalisation bug</w:t>
+            </w:r>
+          </w:p>
+        </w:tc>
+      </w:tr>
+      <w:tr>
+        <w:tc>
+          <w:tcPr/>
+          <w:p>
+            <w:pPr>
+              <w:pStyle w:val="Compact"/>
+            </w:pPr>
+            <w:r>
+              <w:t xml:space="preserve">Stream</w:t>
+            </w:r>
+          </w:p>
+        </w:tc>
+        <w:tc>
+          <w:tcPr/>
+          <w:p>
+            <w:pPr>
+              <w:pStyle w:val="Compact"/>
+            </w:pPr>
+            <w:r>
+              <w:t xml:space="preserve">Unknown schema; event with neither FEI nor known action; Lambda error rate</w:t>
+            </w:r>
+          </w:p>
+        </w:tc>
+        <w:tc>
+          <w:tcPr/>
+          <w:p>
+            <w:pPr>
+              <w:pStyle w:val="Compact"/>
+            </w:pPr>
+            <w:r>
+              <w:t xml:space="preserve">DLQ + alarm; the stream keeps flowing</w:t>
+            </w:r>
+          </w:p>
+        </w:tc>
+      </w:tr>
+      <w:tr>
+        <w:tc>
+          <w:tcPr/>
+          <w:p>
+            <w:pPr>
+              <w:pStyle w:val="Compact"/>
+            </w:pPr>
+            <w:r>
+              <w:t xml:space="preserve">Serving</w:t>
+            </w:r>
+          </w:p>
+        </w:tc>
+        <w:tc>
+          <w:tcPr/>
+          <w:p>
+            <w:pPr>
+              <w:pStyle w:val="Compact"/>
+            </w:pPr>
+            <w:r>
+              <w:t xml:space="preserve">Hourly: DynamoDB watcher count = active watch bridge rows</w:t>
+            </w:r>
+          </w:p>
+        </w:tc>
+        <w:tc>
+          <w:tcPr/>
+          <w:p>
+            <w:pPr>
+              <w:pStyle w:val="Compact"/>
+            </w:pPr>
+            <w:r>
+              <w:t xml:space="preserve">Rebuild from Postgres; alarm on repeat</w:t>
+            </w:r>
+          </w:p>
+        </w:tc>
+      </w:tr>
+    </w:tbl>
+    <w:p>
+      <w:pPr>
+        <w:pStyle w:val="FirstParagraph"/>
+      </w:pPr>
+      <w:r>
+        <w:rPr>
+          <w:b/>
+          <w:bCs/>
+        </w:rPr>
+        <w:t xml:space="preserve">Rule.</w:t>
+      </w:r>
+      <w:r>
+        <w:t xml:space="preserve"> </w:t>
+      </w:r>
+      <w:r>
+        <w:t xml:space="preserve">A batch loads completely or not at all.</w:t>
+      </w:r>
+      <w:r>
+        <w:t xml:space="preserve"> </w:t>
+      </w:r>
+      <w:r>
+        <w:t xml:space="preserve">“Not at all”</w:t>
+      </w:r>
+      <w:r>
+        <w:t xml:space="preserve"> </w:t>
+      </w:r>
+      <w:r>
+        <w:t xml:space="preserve">leaves last week’s data live, which is always better than half a snapshot.</w:t>
+      </w:r>
+    </w:p>
+    <w:p>
+      <w:pPr>
+        <w:pStyle w:val="Heading2"/>
+      </w:pPr>
+      <w:bookmarkStart w:id="44" w:name="_d7639c8214e0261c2749d1c2e48a6268315f029"/>
+      <w:r>
+        <w:t xml:space="preserve">5. Monitoring: the first five signals</w:t>
+      </w:r>
+      <w:bookmarkEnd w:id="44"/>
+    </w:p>
+    <w:p>
+      <w:pPr>
+        <w:pStyle w:val="Compact"/>
+        <w:numPr>
+          <w:ilvl w:val="0"/>
+          <w:numId w:val="1008"/>
+        </w:numPr>
+      </w:pPr>
+      <w:r>
+        <w:rPr>
+          <w:b/>
+          <w:bCs/>
+        </w:rPr>
+        <w:t xml:space="preserve">Alert latency</w:t>
+      </w:r>
+      <w:r>
+        <w:t xml:space="preserve"> </w:t>
+      </w:r>
+      <w:r>
+        <w:t xml:space="preserve">p95 (</w:t>
+      </w:r>
+      <w:r>
+        <w:rPr>
+          <w:rStyle w:val="VerbatimChar"/>
+        </w:rPr>
+        <w:t xml:space="preserve">delivered_at − event_time</w:t>
+      </w:r>
+      <w:r>
+        <w:t xml:space="preserve">) against the 5-minute SLO.</w:t>
+      </w:r>
+    </w:p>
+    <w:p>
+      <w:pPr>
+        <w:pStyle w:val="Compact"/>
+        <w:numPr>
+          <w:ilvl w:val="0"/>
+          <w:numId w:val="1008"/>
+        </w:numPr>
+      </w:pPr>
+      <w:r>
+        <w:rPr>
+          <w:b/>
+          <w:bCs/>
+        </w:rPr>
+        <w:t xml:space="preserve">Undelivered alerts</w:t>
+      </w:r>
+      <w:r>
+        <w:t xml:space="preserve"> </w:t>
+      </w:r>
+      <w:r>
+        <w:t xml:space="preserve">older than 5 minutes. Catches a dead notifier when everything upstream is green.</w:t>
+      </w:r>
+    </w:p>
+    <w:p>
+      <w:pPr>
+        <w:pStyle w:val="Compact"/>
+        <w:numPr>
+          <w:ilvl w:val="0"/>
+          <w:numId w:val="1008"/>
+        </w:numPr>
+      </w:pPr>
+      <w:r>
+        <w:rPr>
+          <w:b/>
+          <w:bCs/>
+        </w:rPr>
+        <w:t xml:space="preserve">Snapshot diff profile</w:t>
+      </w:r>
+      <w:r>
+        <w:t xml:space="preserve"> </w:t>
+      </w:r>
+      <w:r>
+        <w:t xml:space="preserve">per S1/S2 run (inserts, corrections, retractions, row count) against an 8-week baseline.</w:t>
+      </w:r>
+      <w:r>
+        <w:t xml:space="preserve"> </w:t>
+      </w:r>
+      <w:r>
+        <w:rPr>
+          <w:b/>
+          <w:bCs/>
+        </w:rPr>
+        <w:t xml:space="preserve">This is how you know the S1 job</w:t>
+      </w:r>
+      <w:r>
+        <w:rPr>
+          <w:b/>
+          <w:bCs/>
+        </w:rPr>
+        <w:t xml:space="preserve"> </w:t>
+      </w:r>
+      <w:r>
+        <w:rPr>
+          <w:b/>
+          <w:bCs/>
+        </w:rPr>
+        <w:t xml:space="preserve">“succeeded”</w:t>
+      </w:r>
+      <w:r>
+        <w:rPr>
+          <w:b/>
+          <w:bCs/>
+        </w:rPr>
+        <w:t xml:space="preserve"> </w:t>
+      </w:r>
+      <w:r>
+        <w:rPr>
+          <w:b/>
+          <w:bCs/>
+        </w:rPr>
+        <w:t xml:space="preserve">but loaded bad data</w:t>
+      </w:r>
+      <w:r>
+        <w:t xml:space="preserve">: zero corrections for three weeks, or 12k retractions in one, is wrong even when every step exits 0. Plotted, so a human sees the shape.</w:t>
+      </w:r>
+    </w:p>
+    <w:p>
+      <w:pPr>
+        <w:pStyle w:val="Compact"/>
+        <w:numPr>
+          <w:ilvl w:val="0"/>
+          <w:numId w:val="1008"/>
+        </w:numPr>
+      </w:pPr>
+      <w:r>
+        <w:rPr>
+          <w:b/>
+          <w:bCs/>
+        </w:rPr>
+        <w:t xml:space="preserve">Stream health</w:t>
+      </w:r>
+      <w:r>
+        <w:t xml:space="preserve">: Kinesis iterator age (falling behind?) and DLQ depth (dropping silently?).</w:t>
+      </w:r>
+    </w:p>
+    <w:p>
+      <w:pPr>
+        <w:pStyle w:val="Compact"/>
+        <w:numPr>
+          <w:ilvl w:val="0"/>
+          <w:numId w:val="1008"/>
+        </w:numPr>
+      </w:pPr>
+      <w:r>
+        <w:rPr>
+          <w:b/>
+          <w:bCs/>
+        </w:rPr>
+        <w:t xml:space="preserve">Review-queue size and age</w:t>
+      </w:r>
+      <w:r>
+        <w:t xml:space="preserve">: growth faster than stewards clear it means thresholds or normalisation have drifted, and facts are sitting on no profile page.</w:t>
+      </w:r>
+    </w:p>
+    <w:p>
+      <w:pPr>
+        <w:pStyle w:val="FirstParagraph"/>
+      </w:pPr>
+      <w:r>
+        <w:t xml:space="preserve">Plus a nightly reconciliation: current facts per site in Postgres vs documents per site in OpenSearch and Snowflake.</w:t>
+      </w:r>
+    </w:p>
+    <w:p>
+      <w:pPr>
+        <w:pStyle w:val="Heading2"/>
+      </w:pPr>
+      <w:bookmarkStart w:id="45" w:name="_98dbc4c4769492444eac6d3d5f1901a6e73ba88"/>
+      <w:r>
+        <w:t xml:space="preserve">6. What breaks first at 10x</w:t>
+      </w:r>
+      <w:bookmarkEnd w:id="45"/>
+    </w:p>
+    <w:tbl>
+      <w:tblPr>
+        <w:tblStyle w:val="Table"/>
+        <w:tblW w:type="pct" w:w="5000"/>
+        <w:tblLayout w:type="fixed"/>
+        <w:tblLook w:firstRow="1" w:lastRow="0" w:firstColumn="0" w:lastColumn="0" w:noHBand="0" w:noVBand="0" w:val="0020"/>
+      </w:tblPr>
+      <w:tblGrid>
+        <w:gridCol w:w="2640"/>
+        <w:gridCol w:w="2640"/>
+        <w:gridCol w:w="2640"/>
+      </w:tblGrid>
+      <w:tr>
+        <w:trPr>
+          <w:tblHeader w:val="on"/>
+        </w:trPr>
+        <w:tc>
+          <w:tcPr/>
+          <w:p>
+            <w:pPr>
+              <w:pStyle w:val="Compact"/>
+            </w:pPr>
+            <w:r>
+              <w:t xml:space="preserve">Pressure</w:t>
+            </w:r>
+          </w:p>
+        </w:tc>
+        <w:tc>
+          <w:tcPr/>
+          <w:p>
+            <w:pPr>
+              <w:pStyle w:val="Compact"/>
+            </w:pPr>
+            <w:r>
+              <w:t xml:space="preserve">Breaks</w:t>
+            </w:r>
+          </w:p>
+        </w:tc>
+        <w:tc>
+          <w:tcPr/>
+          <w:p>
+            <w:pPr>
+              <w:pStyle w:val="Compact"/>
+            </w:pPr>
+            <w:r>
+              <w:t xml:space="preserve">Change</w:t>
+            </w:r>
+          </w:p>
+        </w:tc>
+      </w:tr>
+      <w:tr>
+        <w:tc>
+          <w:tcPr/>
+          <w:p>
+            <w:pPr>
+              <w:pStyle w:val="Compact"/>
+            </w:pPr>
+            <w:r>
+              <w:t xml:space="preserve">25 agencies, each a different format</w:t>
+            </w:r>
+          </w:p>
+        </w:tc>
+        <w:tc>
+          <w:tcPr/>
+          <w:p>
+            <w:pPr>
+              <w:pStyle w:val="Compact"/>
+            </w:pPr>
+            <w:r>
+              <w:t xml:space="preserve">One hand-written parser per source</w:t>
+            </w:r>
+          </w:p>
+        </w:tc>
+        <w:tc>
+          <w:tcPr/>
+          <w:p>
+            <w:pPr>
+              <w:pStyle w:val="Compact"/>
+            </w:pPr>
+            <w:r>
+              <w:t xml:space="preserve">Parser plugin interface (</w:t>
+            </w:r>
+            <w:r>
+              <w:rPr>
+                <w:rStyle w:val="VerbatimChar"/>
+              </w:rPr>
+              <w:t xml:space="preserve">fetch / parse / natural_key / dates</w:t>
+            </w:r>
+            <w:r>
+              <w:t xml:space="preserve">) and a</w:t>
+            </w:r>
+            <w:r>
+              <w:t xml:space="preserve"> </w:t>
+            </w:r>
+            <w:r>
+              <w:rPr>
+                <w:rStyle w:val="VerbatimChar"/>
+              </w:rPr>
+              <w:t xml:space="preserve">dim_agency</w:t>
+            </w:r>
+            <w:r>
+              <w:t xml:space="preserve"> </w:t>
+            </w:r>
+            <w:r>
+              <w:t xml:space="preserve">table with parser config.</w:t>
+            </w:r>
+            <w:r>
+              <w:t xml:space="preserve"> </w:t>
+            </w:r>
+            <w:r>
+              <w:rPr>
+                <w:b/>
+                <w:bCs/>
+              </w:rPr>
+              <w:t xml:space="preserve">First thing I would change</w:t>
+            </w:r>
+            <w:r>
+              <w:t xml:space="preserve">, before any infrastructure</w:t>
+            </w:r>
+          </w:p>
+        </w:tc>
+      </w:tr>
+      <w:tr>
+        <w:tc>
+          <w:tcPr/>
+          <w:p>
+            <w:pPr>
+              <w:pStyle w:val="Compact"/>
+            </w:pPr>
+            <w:r>
+              <w:t xml:space="preserve">1M sites</w:t>
+            </w:r>
+          </w:p>
+        </w:tc>
+        <w:tc>
+          <w:tcPr/>
+          <w:p>
+            <w:pPr>
+              <w:pStyle w:val="Compact"/>
+            </w:pPr>
+            <w:r>
+              <w:t xml:space="preserve">Trigram candidate search over all of</w:t>
+            </w:r>
+            <w:r>
+              <w:t xml:space="preserve"> </w:t>
+            </w:r>
+            <w:r>
+              <w:rPr>
+                <w:rStyle w:val="VerbatimChar"/>
+              </w:rPr>
+              <w:t xml:space="preserve">dim_site</w:t>
+            </w:r>
+          </w:p>
+        </w:tc>
+        <w:tc>
+          <w:tcPr/>
+          <w:p>
+            <w:pPr>
+              <w:pStyle w:val="Compact"/>
+            </w:pPr>
+            <w:r>
+              <w:t xml:space="preserve">Candidate generation in OpenSearch (already running); batch ER on Spark with Splink for backfills</w:t>
+            </w:r>
+          </w:p>
+        </w:tc>
+      </w:tr>
+      <w:tr>
+        <w:tc>
+          <w:tcPr/>
+          <w:p>
+            <w:pPr>
+              <w:pStyle w:val="Compact"/>
+            </w:pPr>
+            <w:r>
+              <w:t xml:space="preserve">2k events/s bursts</w:t>
+            </w:r>
+          </w:p>
+        </w:tc>
+        <w:tc>
+          <w:tcPr/>
+          <w:p>
+            <w:pPr>
+              <w:pStyle w:val="Compact"/>
+            </w:pPr>
+            <w:r>
+              <w:t xml:space="preserve">Per-event Postgres writes from Lambda</w:t>
+            </w:r>
+          </w:p>
+        </w:tc>
+        <w:tc>
+          <w:tcPr/>
+          <w:p>
+            <w:pPr>
+              <w:pStyle w:val="Compact"/>
+            </w:pPr>
+            <w:r>
+              <w:t xml:space="preserve">Micro-batching (already 100/invocation), RDS Proxy; then Flink doing dedupe and version compare before Postgres</w:t>
+            </w:r>
+          </w:p>
+        </w:tc>
+      </w:tr>
+      <w:tr>
+        <w:tc>
+          <w:tcPr/>
+          <w:p>
+            <w:pPr>
+              <w:pStyle w:val="Compact"/>
+            </w:pPr>
+            <w:r>
+              <w:t xml:space="preserve">400 customers, 250k watches</w:t>
+            </w:r>
+          </w:p>
+        </w:tc>
+        <w:tc>
+          <w:tcPr/>
+          <w:p>
+            <w:pPr>
+              <w:pStyle w:val="Compact"/>
+            </w:pPr>
+            <w:r>
+              <w:t xml:space="preserve">Fan-out per event</w:t>
+            </w:r>
+          </w:p>
+        </w:tc>
+        <w:tc>
+          <w:tcPr/>
+          <w:p>
+            <w:pPr>
+              <w:pStyle w:val="Compact"/>
+            </w:pPr>
+            <w:r>
+              <w:t xml:space="preserve">DynamoDB handles it; batch notifications per customer per minute</w:t>
+            </w:r>
+          </w:p>
+        </w:tc>
+      </w:tr>
+      <w:tr>
+        <w:tc>
+          <w:tcPr/>
+          <w:p>
+            <w:pPr>
+              <w:pStyle w:val="Compact"/>
+            </w:pPr>
+            <w:r>
+              <w:t xml:space="preserve">Nightly full export</w:t>
+            </w:r>
+          </w:p>
+        </w:tc>
+        <w:tc>
+          <w:tcPr/>
+          <w:p>
+            <w:pPr>
+              <w:pStyle w:val="Compact"/>
+            </w:pPr>
+            <w:r>
+              <w:t xml:space="preserve">Gets long</w:t>
+            </w:r>
+          </w:p>
+        </w:tc>
+        <w:tc>
+          <w:tcPr/>
+          <w:p>
+            <w:pPr>
+              <w:pStyle w:val="Compact"/>
+            </w:pPr>
+            <w:r>
+              <w:t xml:space="preserve">Incremental export on</w:t>
+            </w:r>
+            <w:r>
+              <w:t xml:space="preserve"> </w:t>
+            </w:r>
+            <w:r>
+              <w:rPr>
+                <w:rStyle w:val="VerbatimChar"/>
+              </w:rPr>
+              <w:t xml:space="preserve">valid_from &gt; last run</w:t>
+            </w:r>
+          </w:p>
+        </w:tc>
+      </w:tr>
+    </w:tbl>
+    <w:p>
+      <w:pPr>
+        <w:pStyle w:val="Heading2"/>
+      </w:pPr>
+      <w:bookmarkStart w:id="46" w:name="_0a0641f445e3e0b4b0daf89f6bc9b9d2d34a50c"/>
+      <w:r>
+        <w:t xml:space="preserve">7. Six weeks with this team</w:t>
       </w:r>
       <w:bookmarkEnd w:id="46"/>
     </w:p>
@@ -13514,29 +14145,29 @@
               <w:pStyle w:val="Compact"/>
             </w:pPr>
             <w:r>
-              <w:t xml:space="preserve">Layer</w:t>
-            </w:r>
-          </w:p>
-        </w:tc>
-        <w:tc>
-          <w:tcPr/>
-          <w:p>
-            <w:pPr>
-              <w:pStyle w:val="Compact"/>
-            </w:pPr>
-            <w:r>
-              <w:t xml:space="preserve">Checks</w:t>
-            </w:r>
-          </w:p>
-        </w:tc>
-        <w:tc>
-          <w:tcPr/>
-          <w:p>
-            <w:pPr>
-              <w:pStyle w:val="Compact"/>
-            </w:pPr>
-            <w:r>
-              <w:t xml:space="preserve">On failure</w:t>
+              <w:t xml:space="preserve">Weeks</w:t>
+            </w:r>
+          </w:p>
+        </w:tc>
+        <w:tc>
+          <w:tcPr/>
+          <w:p>
+            <w:pPr>
+              <w:pStyle w:val="Compact"/>
+            </w:pPr>
+            <w:r>
+              <w:t xml:space="preserve">Build</w:t>
+            </w:r>
+          </w:p>
+        </w:tc>
+        <w:tc>
+          <w:tcPr/>
+          <w:p>
+            <w:pPr>
+              <w:pStyle w:val="Compact"/>
+            </w:pPr>
+            <w:r>
+              <w:t xml:space="preserve">Reason</w:t>
             </w:r>
           </w:p>
         </w:tc>
@@ -13549,41 +14180,29 @@
               <w:pStyle w:val="Compact"/>
             </w:pPr>
             <w:r>
-              <w:t xml:space="preserve">Raw</w:t>
-            </w:r>
-          </w:p>
-        </w:tc>
-        <w:tc>
-          <w:tcPr/>
-          <w:p>
-            <w:pPr>
-              <w:pStyle w:val="Compact"/>
-            </w:pPr>
-            <w:r>
-              <w:t xml:space="preserve">File present, non-empty, parseable, expected columns</w:t>
-            </w:r>
-          </w:p>
-        </w:tc>
-        <w:tc>
-          <w:tcPr/>
-          <w:p>
-            <w:pPr>
-              <w:pStyle w:val="Compact"/>
-            </w:pPr>
-            <w:r>
-              <w:t xml:space="preserve">Batch</w:t>
-            </w:r>
-            <w:r>
-              <w:t xml:space="preserve"> </w:t>
-            </w:r>
-            <w:r>
-              <w:rPr>
-                <w:rStyle w:val="VerbatimChar"/>
-              </w:rPr>
-              <w:t xml:space="preserve">FAILED</w:t>
-            </w:r>
-            <w:r>
-              <w:t xml:space="preserve">; page on-call; nothing downstream runs</w:t>
+              <w:t xml:space="preserve">1–2</w:t>
+            </w:r>
+          </w:p>
+        </w:tc>
+        <w:tc>
+          <w:tcPr/>
+          <w:p>
+            <w:pPr>
+              <w:pStyle w:val="Compact"/>
+            </w:pPr>
+            <w:r>
+              <w:t xml:space="preserve">Raw landing for all five sources; Postgres model; S1 parse + diff + SCD2; FEI-based sites</w:t>
+            </w:r>
+          </w:p>
+        </w:tc>
+        <w:tc>
+          <w:tcPr/>
+          <w:p>
+            <w:pPr>
+              <w:pStyle w:val="Compact"/>
+            </w:pPr>
+            <w:r>
+              <w:t xml:space="preserve">Landing is append-only and cheap, and history starts accumulating from day one</w:t>
             </w:r>
           </w:p>
         </w:tc>
@@ -13596,35 +14215,29 @@
               <w:pStyle w:val="Compact"/>
             </w:pPr>
             <w:r>
-              <w:t xml:space="preserve">Parse</w:t>
-            </w:r>
-          </w:p>
-        </w:tc>
-        <w:tc>
-          <w:tcPr/>
-          <w:p>
-            <w:pPr>
-              <w:pStyle w:val="Compact"/>
-            </w:pPr>
-            <w:r>
-              <w:t xml:space="preserve">Date-parse failures &lt; 0.5%; country mapping failures = 0; duplicate keys; null-FEI rate vs baseline</w:t>
-            </w:r>
-          </w:p>
-        </w:tc>
-        <w:tc>
-          <w:tcPr/>
-          <w:p>
-            <w:pPr>
-              <w:pStyle w:val="Compact"/>
-            </w:pPr>
-            <w:r>
-              <w:rPr>
-                <w:rStyle w:val="VerbatimChar"/>
-              </w:rPr>
-              <w:t xml:space="preserve">QUARANTINED</w:t>
-            </w:r>
-            <w:r>
-              <w:t xml:space="preserve">; last good load stays live; rejects written to a side table</w:t>
+              <w:t xml:space="preserve">3–4</w:t>
+            </w:r>
+          </w:p>
+        </w:tc>
+        <w:tc>
+          <w:tcPr/>
+          <w:p>
+            <w:pPr>
+              <w:pStyle w:val="Compact"/>
+            </w:pPr>
+            <w:r>
+              <w:t xml:space="preserve">S4 stream apply, DynamoDB watchers, alerts end to end; S5 apply with immediate delete; basic U1 profile</w:t>
+            </w:r>
+          </w:p>
+        </w:tc>
+        <w:tc>
+          <w:tcPr/>
+          <w:p>
+            <w:pPr>
+              <w:pStyle w:val="Compact"/>
+            </w:pPr>
+            <w:r>
+              <w:t xml:space="preserve">Alerts are what customers pay for</w:t>
             </w:r>
           </w:p>
         </w:tc>
@@ -13637,153 +14250,29 @@
               <w:pStyle w:val="Compact"/>
             </w:pPr>
             <w:r>
-              <w:t xml:space="preserve">Diff</w:t>
-            </w:r>
-          </w:p>
-        </w:tc>
-        <w:tc>
-          <w:tcPr/>
-          <w:p>
-            <w:pPr>
-              <w:pStyle w:val="Compact"/>
-            </w:pPr>
-            <w:r>
-              <w:t xml:space="preserve">Row count ±20% of last snapshot;</w:t>
-            </w:r>
-            <w:r>
-              <w:t xml:space="preserve"> </w:t>
-            </w:r>
-            <w:r>
-              <w:rPr>
-                <w:b/>
-                <w:bCs/>
-              </w:rPr>
-              <w:t xml:space="preserve">retraction rate &lt; 2%</w:t>
-            </w:r>
-            <w:r>
-              <w:t xml:space="preserve">; classification mix vs baseline</w:t>
-            </w:r>
-          </w:p>
-        </w:tc>
-        <w:tc>
-          <w:tcPr/>
-          <w:p>
-            <w:pPr>
-              <w:pStyle w:val="Compact"/>
-            </w:pPr>
-            <w:r>
-              <w:rPr>
-                <w:rStyle w:val="VerbatimChar"/>
-              </w:rPr>
-              <w:t xml:space="preserve">QUARANTINED</w:t>
-            </w:r>
-            <w:r>
-              <w:t xml:space="preserve">. A 30% retraction rate is a truncated file, not 75k real retractions. The single most important check</w:t>
-            </w:r>
-          </w:p>
-        </w:tc>
-      </w:tr>
-      <w:tr>
-        <w:tc>
-          <w:tcPr/>
-          <w:p>
-            <w:pPr>
-              <w:pStyle w:val="Compact"/>
-            </w:pPr>
-            <w:r>
-              <w:t xml:space="preserve">ER</w:t>
-            </w:r>
-          </w:p>
-        </w:tc>
-        <w:tc>
-          <w:tcPr/>
-          <w:p>
-            <w:pPr>
-              <w:pStyle w:val="Compact"/>
-            </w:pPr>
-            <w:r>
-              <w:t xml:space="preserve">New-site rate, auto-link rate, review-queue growth vs rolling baseline</w:t>
-            </w:r>
-          </w:p>
-        </w:tc>
-        <w:tc>
-          <w:tcPr/>
-          <w:p>
-            <w:pPr>
-              <w:pStyle w:val="Compact"/>
-            </w:pPr>
-            <w:r>
-              <w:t xml:space="preserve">Warn; large shifts usually mean a normalisation bug</w:t>
-            </w:r>
-          </w:p>
-        </w:tc>
-      </w:tr>
-      <w:tr>
-        <w:tc>
-          <w:tcPr/>
-          <w:p>
-            <w:pPr>
-              <w:pStyle w:val="Compact"/>
-            </w:pPr>
-            <w:r>
-              <w:t xml:space="preserve">Stream</w:t>
-            </w:r>
-          </w:p>
-        </w:tc>
-        <w:tc>
-          <w:tcPr/>
-          <w:p>
-            <w:pPr>
-              <w:pStyle w:val="Compact"/>
-            </w:pPr>
-            <w:r>
-              <w:t xml:space="preserve">Unknown schema; event with neither FEI nor known action; Lambda error rate</w:t>
-            </w:r>
-          </w:p>
-        </w:tc>
-        <w:tc>
-          <w:tcPr/>
-          <w:p>
-            <w:pPr>
-              <w:pStyle w:val="Compact"/>
-            </w:pPr>
-            <w:r>
-              <w:t xml:space="preserve">DLQ + alarm; the stream keeps flowing</w:t>
-            </w:r>
-          </w:p>
-        </w:tc>
-      </w:tr>
-      <w:tr>
-        <w:tc>
-          <w:tcPr/>
-          <w:p>
-            <w:pPr>
-              <w:pStyle w:val="Compact"/>
-            </w:pPr>
-            <w:r>
-              <w:t xml:space="preserve">Serving</w:t>
-            </w:r>
-          </w:p>
-        </w:tc>
-        <w:tc>
-          <w:tcPr/>
-          <w:p>
-            <w:pPr>
-              <w:pStyle w:val="Compact"/>
-            </w:pPr>
-            <w:r>
-              <w:t xml:space="preserve">Hourly: DynamoDB watcher count = active watch bridge rows</w:t>
-            </w:r>
-          </w:p>
-        </w:tc>
-        <w:tc>
-          <w:tcPr/>
-          <w:p>
-            <w:pPr>
-              <w:pStyle w:val="Compact"/>
-            </w:pPr>
-            <w:r>
-              <w:t xml:space="preserve">Rebuild from Postgres; alarm on repeat</w:t>
+              <w:t xml:space="preserve">5–6</w:t>
+            </w:r>
+          </w:p>
+        </w:tc>
+        <w:tc>
+          <w:tcPr/>
+          <w:p>
+            <w:pPr>
+              <w:pStyle w:val="Compact"/>
+            </w:pPr>
+            <w:r>
+              <w:t xml:space="preserve">ER library with the three bands and a bare review table; S3 letters into Postgres and OpenSearch; quarantine + the five monitors</w:t>
+            </w:r>
+          </w:p>
+        </w:tc>
+        <w:tc>
+          <w:tcPr/>
+          <w:p>
+            <w:pPr>
+              <w:pStyle w:val="Compact"/>
+            </w:pPr>
+            <w:r>
+              <w:t xml:space="preserve">Quality tooling improves a product that already exists</w:t>
             </w:r>
           </w:p>
         </w:tc>
@@ -13798,36 +14287,47 @@
           <w:b/>
           <w:bCs/>
         </w:rPr>
-        <w:t xml:space="preserve">Rule.</w:t>
-      </w:r>
-      <w:r>
-        <w:t xml:space="preserve"> </w:t>
-      </w:r>
-      <w:r>
-        <w:t xml:space="preserve">A batch loads completely or not at all.</w:t>
-      </w:r>
-      <w:r>
-        <w:t xml:space="preserve"> </w:t>
-      </w:r>
-      <w:r>
-        <w:t xml:space="preserve">“Not at all”</w:t>
-      </w:r>
-      <w:r>
-        <w:t xml:space="preserve"> </w:t>
-      </w:r>
-      <w:r>
-        <w:t xml:space="preserve">leaves last week’s data live, which is always better than half a snapshot.</w:t>
-      </w:r>
+        <w:t xml:space="preserve">Deliberately deferred:</w:t>
+      </w:r>
+      <w:r>
+        <w:t xml:space="preserve"> </w:t>
+      </w:r>
+      <w:r>
+        <w:t xml:space="preserve">S2 (monthly; week 7 loses nothing), NLP tagging (search works without it), Snowflake marts (U4 can be served from Postgres for 40 customers), a steward UI (a table and two SQL functions suffice for one steward), geocoding, the 15-year backfill (needs a stable pipeline; raw landing from day one means we lose nothing by waiting).</w:t>
+      </w:r>
+    </w:p>
+    <w:p>
+      <w:r>
+        <w:br w:type="page"/>
+      </w:r>
+    </w:p>
+    <w:p>
+      <w:pPr>
+        <w:pStyle w:val="Heading1"/>
+      </w:pPr>
+      <w:bookmarkStart w:id="47" w:name="_62599194d5a392fee9acfc2cac13209c91afdf4"/>
+      <w:r>
+        <w:t xml:space="preserve">Assumptions, AI usage, time spent</w:t>
+      </w:r>
+      <w:bookmarkEnd w:id="47"/>
     </w:p>
     <w:p>
       <w:pPr>
         <w:pStyle w:val="Heading2"/>
       </w:pPr>
-      <w:bookmarkStart w:id="47" w:name="_d7639c8214e0261c2749d1c2e48a6268315f029"/>
-      <w:r>
-        <w:t xml:space="preserve">5. Monitoring: the first five signals</w:t>
-      </w:r>
-      <w:bookmarkEnd w:id="47"/>
+      <w:bookmarkStart w:id="48" w:name="_assumptions"/>
+      <w:r>
+        <w:t xml:space="preserve">Assumptions</w:t>
+      </w:r>
+      <w:bookmarkEnd w:id="48"/>
+    </w:p>
+    <w:p>
+      <w:pPr>
+        <w:pStyle w:val="FirstParagraph"/>
+      </w:pPr>
+      <w:r>
+        <w:t xml:space="preserve">Where the brief was silent or ambiguous, I assumed the following.</w:t>
+      </w:r>
     </w:p>
     <w:p>
       <w:pPr>
@@ -13842,22 +14342,40 @@
           <w:b/>
           <w:bCs/>
         </w:rPr>
-        <w:t xml:space="preserve">Alert latency</w:t>
-      </w:r>
-      <w:r>
-        <w:t xml:space="preserve"> </w:t>
-      </w:r>
-      <w:r>
-        <w:t xml:space="preserve">p95 (</w:t>
+        <w:t xml:space="preserve">S1 dates</w:t>
+      </w:r>
+      <w:r>
+        <w:t xml:space="preserve"> </w:t>
+      </w:r>
+      <w:r>
+        <w:t xml:space="preserve">parse as ISO first, otherwise</w:t>
+      </w:r>
+      <w:r>
+        <w:t xml:space="preserve"> </w:t>
       </w:r>
       <w:r>
         <w:rPr>
           <w:rStyle w:val="VerbatimChar"/>
         </w:rPr>
-        <w:t xml:space="preserve">delivered_at − event_time</w:t>
-      </w:r>
-      <w:r>
-        <w:t xml:space="preserve">) against the 5-minute SLO.</w:t>
+        <w:t xml:space="preserve">MM/DD/YYYY</w:t>
+      </w:r>
+      <w:r>
+        <w:t xml:space="preserve">;</w:t>
+      </w:r>
+      <w:r>
+        <w:t xml:space="preserve"> </w:t>
+      </w:r>
+      <w:r>
+        <w:rPr>
+          <w:rStyle w:val="VerbatimChar"/>
+        </w:rPr>
+        <w:t xml:space="preserve">08/02/2026</w:t>
+      </w:r>
+      <w:r>
+        <w:t xml:space="preserve"> </w:t>
+      </w:r>
+      <w:r>
+        <w:t xml:space="preserve">is 2 August 2026. The original string is kept so the rule can change without re-fetching.</w:t>
       </w:r>
     </w:p>
     <w:p>
@@ -13873,13 +14391,10 @@
           <w:b/>
           <w:bCs/>
         </w:rPr>
-        <w:t xml:space="preserve">Undelivered alerts</w:t>
-      </w:r>
-      <w:r>
-        <w:t xml:space="preserve"> </w:t>
-      </w:r>
-      <w:r>
-        <w:t xml:space="preserve">older than 5 minutes. Catches a dead notifier when everything upstream is green.</w:t>
+        <w:t xml:space="preserve">S1/S2 snapshots are complete</w:t>
+      </w:r>
+      <w:r>
+        <w:t xml:space="preserve">: a row missing from the new snapshot is a retraction. A retraction rate above 2% is treated as a bad file and quarantined instead.</w:t>
       </w:r>
     </w:p>
     <w:p>
@@ -13895,54 +14410,28 @@
           <w:b/>
           <w:bCs/>
         </w:rPr>
-        <w:t xml:space="preserve">Snapshot diff profile</w:t>
-      </w:r>
-      <w:r>
-        <w:t xml:space="preserve"> </w:t>
-      </w:r>
-      <w:r>
-        <w:t xml:space="preserve">per S1/S2 run (inserts, corrections, retractions, row count) against an 8-week baseline.</w:t>
-      </w:r>
-      <w:r>
-        <w:t xml:space="preserve"> </w:t>
+        <w:t xml:space="preserve">S2</w:t>
       </w:r>
       <w:r>
         <w:rPr>
           <w:b/>
           <w:bCs/>
         </w:rPr>
-        <w:t xml:space="preserve">This is how you know the S1 job</w:t>
-      </w:r>
-      <w:r>
-        <w:rPr>
+        <w:t xml:space="preserve"> </w:t>
+      </w:r>
+      <w:r>
+        <w:rPr>
+          <w:rStyle w:val="VerbatimChar"/>
           <w:b/>
           <w:bCs/>
         </w:rPr>
-        <w:t xml:space="preserve"> </w:t>
-      </w:r>
-      <w:r>
-        <w:rPr>
-          <w:b/>
-          <w:bCs/>
-        </w:rPr>
-        <w:t xml:space="preserve">“succeeded”</w:t>
-      </w:r>
-      <w:r>
-        <w:rPr>
-          <w:b/>
-          <w:bCs/>
-        </w:rPr>
-        <w:t xml:space="preserve"> </w:t>
-      </w:r>
-      <w:r>
-        <w:rPr>
-          <w:b/>
-          <w:bCs/>
-        </w:rPr>
-        <w:t xml:space="preserve">but loaded bad data</w:t>
-      </w:r>
-      <w:r>
-        <w:t xml:space="preserve">: zero corrections for three weeks, or 12k retractions in one, is wrong even when every step exits 0. Plotted, so a human sees the shape.</w:t>
+        <w:t xml:space="preserve">WITHDRAWN</w:t>
+      </w:r>
+      <w:r>
+        <w:t xml:space="preserve"> </w:t>
+      </w:r>
+      <w:r>
+        <w:t xml:space="preserve">is a correction (new version), not a retraction: the document still exists. In-file duplicates are identical copies and are dropped before diffing.</w:t>
       </w:r>
     </w:p>
     <w:p>
@@ -13958,10 +14447,58 @@
           <w:b/>
           <w:bCs/>
         </w:rPr>
-        <w:t xml:space="preserve">Stream health</w:t>
-      </w:r>
-      <w:r>
-        <w:t xml:space="preserve">: Kinesis iterator age (falling behind?) and DLQ depth (dropping silently?).</w:t>
+        <w:t xml:space="preserve">S4</w:t>
+      </w:r>
+      <w:r>
+        <w:rPr>
+          <w:b/>
+          <w:bCs/>
+        </w:rPr>
+        <w:t xml:space="preserve"> </w:t>
+      </w:r>
+      <w:r>
+        <w:rPr>
+          <w:rStyle w:val="VerbatimChar"/>
+          <w:b/>
+          <w:bCs/>
+        </w:rPr>
+        <w:t xml:space="preserve">version</w:t>
+      </w:r>
+      <w:r>
+        <w:t xml:space="preserve"> </w:t>
+      </w:r>
+      <w:r>
+        <w:t xml:space="preserve">is monotonically increasing per</w:t>
+      </w:r>
+      <w:r>
+        <w:t xml:space="preserve"> </w:t>
+      </w:r>
+      <w:r>
+        <w:rPr>
+          <w:rStyle w:val="VerbatimChar"/>
+        </w:rPr>
+        <w:t xml:space="preserve">action_id</w:t>
+      </w:r>
+      <w:r>
+        <w:t xml:space="preserve"> </w:t>
+      </w:r>
+      <w:r>
+        <w:t xml:space="preserve">and is the authoritative order. A RETRACT for an action never seen is stored as a tombstone and queued for review, not alerted (it carries no FEI). An unknown</w:t>
+      </w:r>
+      <w:r>
+        <w:t xml:space="preserve"> </w:t>
+      </w:r>
+      <w:r>
+        <w:rPr>
+          <w:rStyle w:val="VerbatimChar"/>
+        </w:rPr>
+        <w:t xml:space="preserve">schema_version</w:t>
+      </w:r>
+      <w:r>
+        <w:t xml:space="preserve"> </w:t>
+      </w:r>
+      <w:r>
+        <w:t xml:space="preserve">goes to a dead-letter queue rather than being parsed on a best-effort basis.</w:t>
       </w:r>
     </w:p>
     <w:p>
@@ -13977,526 +14514,146 @@
           <w:b/>
           <w:bCs/>
         </w:rPr>
-        <w:t xml:space="preserve">Review-queue size and age</w:t>
-      </w:r>
-      <w:r>
-        <w:t xml:space="preserve">: growth faster than stewards clear it means thresholds or normalisation have drifted, and facts are sitting on no profile page.</w:t>
-      </w:r>
+        <w:t xml:space="preserve">S5 CDC</w:t>
+      </w:r>
+      <w:r>
+        <w:t xml:space="preserve"> </w:t>
+      </w:r>
+      <w:r>
+        <w:t xml:space="preserve">is produced by the customer-app team (Debezium on their PostgreSQL); we consume a topic and never connect to their database.</w:t>
+      </w:r>
+    </w:p>
+    <w:p>
+      <w:pPr>
+        <w:pStyle w:val="Compact"/>
+        <w:numPr>
+          <w:ilvl w:val="0"/>
+          <w:numId w:val="1009"/>
+        </w:numPr>
+      </w:pPr>
+      <w:r>
+        <w:rPr>
+          <w:b/>
+          <w:bCs/>
+        </w:rPr>
+        <w:t xml:space="preserve">Within one agency the agency’s ID is authoritative</w:t>
+      </w:r>
+      <w:r>
+        <w:t xml:space="preserve">: same FEI = same site. Cross-agency matching auto-links at ≥ 0.95, sends 0.75–0.95 to a human, creates a new site below 0.75. Thresholds are a starting point to be tuned on steward decisions. At least one part-time steward is available.</w:t>
+      </w:r>
+    </w:p>
+    <w:p>
+      <w:pPr>
+        <w:pStyle w:val="Compact"/>
+        <w:numPr>
+          <w:ilvl w:val="0"/>
+          <w:numId w:val="1009"/>
+        </w:numPr>
+      </w:pPr>
+      <w:r>
+        <w:rPr>
+          <w:b/>
+          <w:bCs/>
+        </w:rPr>
+        <w:t xml:space="preserve">“New or changed”</w:t>
+      </w:r>
+      <w:r>
+        <w:rPr>
+          <w:b/>
+          <w:bCs/>
+        </w:rPr>
+        <w:t xml:space="preserve"> </w:t>
+      </w:r>
+      <w:r>
+        <w:rPr>
+          <w:b/>
+          <w:bCs/>
+        </w:rPr>
+        <w:t xml:space="preserve">enforcement action includes a RETRACT</w:t>
+      </w:r>
+      <w:r>
+        <w:t xml:space="preserve">: customers told about an action are told when it is withdrawn.</w:t>
+      </w:r>
+    </w:p>
+    <w:p>
+      <w:pPr>
+        <w:pStyle w:val="Compact"/>
+        <w:numPr>
+          <w:ilvl w:val="0"/>
+          <w:numId w:val="1009"/>
+        </w:numPr>
+      </w:pPr>
+      <w:r>
+        <w:rPr>
+          <w:b/>
+          <w:bCs/>
+        </w:rPr>
+        <w:t xml:space="preserve">The customer app reads site profiles from the model</w:t>
+      </w:r>
+      <w:r>
+        <w:t xml:space="preserve"> </w:t>
+      </w:r>
+      <w:r>
+        <w:t xml:space="preserve">via an API, which is why the model needs an OLTP store (Part B §5 states when that would change).</w:t>
+      </w:r>
+    </w:p>
+    <w:p>
+      <w:pPr>
+        <w:pStyle w:val="Compact"/>
+        <w:numPr>
+          <w:ilvl w:val="0"/>
+          <w:numId w:val="1009"/>
+        </w:numPr>
+      </w:pPr>
+      <w:r>
+        <w:rPr>
+          <w:b/>
+          <w:bCs/>
+        </w:rPr>
+        <w:t xml:space="preserve">15-year historical snapshots can be obtained</w:t>
+      </w:r>
+      <w:r>
+        <w:t xml:space="preserve"> </w:t>
+      </w:r>
+      <w:r>
+        <w:t xml:space="preserve">for S1 and S2. If only current state is available, history starts at go-live, flagged as such.</w:t>
+      </w:r>
+    </w:p>
+    <w:p>
+      <w:pPr>
+        <w:pStyle w:val="Compact"/>
+        <w:numPr>
+          <w:ilvl w:val="0"/>
+          <w:numId w:val="1009"/>
+        </w:numPr>
+      </w:pPr>
+      <w:r>
+        <w:rPr>
+          <w:b/>
+          <w:bCs/>
+        </w:rPr>
+        <w:t xml:space="preserve">Infrastructure is AWS</w:t>
+      </w:r>
+      <w:r>
+        <w:t xml:space="preserve">, one region, our account separate from the customer app’s.</w:t>
+      </w:r>
+    </w:p>
+    <w:p>
+      <w:pPr>
+        <w:pStyle w:val="Heading2"/>
+      </w:pPr>
+      <w:bookmarkStart w:id="49" w:name="_63249b6f657b864a327a7fc992cdbb6ebaad32c"/>
+      <w:r>
+        <w:t xml:space="preserve">How AI tools were used</w:t>
+      </w:r>
+      <w:bookmarkEnd w:id="49"/>
     </w:p>
     <w:p>
       <w:pPr>
         <w:pStyle w:val="FirstParagraph"/>
       </w:pPr>
       <w:r>
-        <w:t xml:space="preserve">Plus a nightly reconciliation: current facts per site in Postgres vs documents per site in OpenSearch and Snowflake.</w:t>
-      </w:r>
-    </w:p>
-    <w:p>
-      <w:pPr>
-        <w:pStyle w:val="Heading2"/>
-      </w:pPr>
-      <w:bookmarkStart w:id="48" w:name="_98dbc4c4769492444eac6d3d5f1901a6e73ba88"/>
-      <w:r>
-        <w:t xml:space="preserve">6. What breaks first at 10x</w:t>
-      </w:r>
-      <w:bookmarkEnd w:id="48"/>
-    </w:p>
-    <w:tbl>
-      <w:tblPr>
-        <w:tblStyle w:val="Table"/>
-        <w:tblW w:type="pct" w:w="5000"/>
-        <w:tblLayout w:type="fixed"/>
-        <w:tblLook w:firstRow="1" w:lastRow="0" w:firstColumn="0" w:lastColumn="0" w:noHBand="0" w:noVBand="0" w:val="0020"/>
-      </w:tblPr>
-      <w:tblGrid>
-        <w:gridCol w:w="2640"/>
-        <w:gridCol w:w="2640"/>
-        <w:gridCol w:w="2640"/>
-      </w:tblGrid>
-      <w:tr>
-        <w:trPr>
-          <w:tblHeader w:val="on"/>
-        </w:trPr>
-        <w:tc>
-          <w:tcPr/>
-          <w:p>
-            <w:pPr>
-              <w:pStyle w:val="Compact"/>
-            </w:pPr>
-            <w:r>
-              <w:t xml:space="preserve">Pressure</w:t>
-            </w:r>
-          </w:p>
-        </w:tc>
-        <w:tc>
-          <w:tcPr/>
-          <w:p>
-            <w:pPr>
-              <w:pStyle w:val="Compact"/>
-            </w:pPr>
-            <w:r>
-              <w:t xml:space="preserve">Breaks</w:t>
-            </w:r>
-          </w:p>
-        </w:tc>
-        <w:tc>
-          <w:tcPr/>
-          <w:p>
-            <w:pPr>
-              <w:pStyle w:val="Compact"/>
-            </w:pPr>
-            <w:r>
-              <w:t xml:space="preserve">Change</w:t>
-            </w:r>
-          </w:p>
-        </w:tc>
-      </w:tr>
-      <w:tr>
-        <w:tc>
-          <w:tcPr/>
-          <w:p>
-            <w:pPr>
-              <w:pStyle w:val="Compact"/>
-            </w:pPr>
-            <w:r>
-              <w:t xml:space="preserve">25 agencies, each a different format</w:t>
-            </w:r>
-          </w:p>
-        </w:tc>
-        <w:tc>
-          <w:tcPr/>
-          <w:p>
-            <w:pPr>
-              <w:pStyle w:val="Compact"/>
-            </w:pPr>
-            <w:r>
-              <w:t xml:space="preserve">One hand-written parser per source</w:t>
-            </w:r>
-          </w:p>
-        </w:tc>
-        <w:tc>
-          <w:tcPr/>
-          <w:p>
-            <w:pPr>
-              <w:pStyle w:val="Compact"/>
-            </w:pPr>
-            <w:r>
-              <w:t xml:space="preserve">Parser plugin interface (</w:t>
-            </w:r>
-            <w:r>
-              <w:rPr>
-                <w:rStyle w:val="VerbatimChar"/>
-              </w:rPr>
-              <w:t xml:space="preserve">fetch / parse / natural_key / dates</w:t>
-            </w:r>
-            <w:r>
-              <w:t xml:space="preserve">) and a</w:t>
-            </w:r>
-            <w:r>
-              <w:t xml:space="preserve"> </w:t>
-            </w:r>
-            <w:r>
-              <w:rPr>
-                <w:rStyle w:val="VerbatimChar"/>
-              </w:rPr>
-              <w:t xml:space="preserve">dim_agency</w:t>
-            </w:r>
-            <w:r>
-              <w:t xml:space="preserve"> </w:t>
-            </w:r>
-            <w:r>
-              <w:t xml:space="preserve">table with parser config.</w:t>
-            </w:r>
-            <w:r>
-              <w:t xml:space="preserve"> </w:t>
-            </w:r>
-            <w:r>
-              <w:rPr>
-                <w:b/>
-                <w:bCs/>
-              </w:rPr>
-              <w:t xml:space="preserve">First thing I would change</w:t>
-            </w:r>
-            <w:r>
-              <w:t xml:space="preserve">, before any infrastructure</w:t>
-            </w:r>
-          </w:p>
-        </w:tc>
-      </w:tr>
-      <w:tr>
-        <w:tc>
-          <w:tcPr/>
-          <w:p>
-            <w:pPr>
-              <w:pStyle w:val="Compact"/>
-            </w:pPr>
-            <w:r>
-              <w:t xml:space="preserve">1M sites</w:t>
-            </w:r>
-          </w:p>
-        </w:tc>
-        <w:tc>
-          <w:tcPr/>
-          <w:p>
-            <w:pPr>
-              <w:pStyle w:val="Compact"/>
-            </w:pPr>
-            <w:r>
-              <w:t xml:space="preserve">Trigram candidate search over all of</w:t>
-            </w:r>
-            <w:r>
-              <w:t xml:space="preserve"> </w:t>
-            </w:r>
-            <w:r>
-              <w:rPr>
-                <w:rStyle w:val="VerbatimChar"/>
-              </w:rPr>
-              <w:t xml:space="preserve">dim_site</w:t>
-            </w:r>
-          </w:p>
-        </w:tc>
-        <w:tc>
-          <w:tcPr/>
-          <w:p>
-            <w:pPr>
-              <w:pStyle w:val="Compact"/>
-            </w:pPr>
-            <w:r>
-              <w:t xml:space="preserve">Candidate generation in OpenSearch (already running); batch ER on Spark with Splink for backfills</w:t>
-            </w:r>
-          </w:p>
-        </w:tc>
-      </w:tr>
-      <w:tr>
-        <w:tc>
-          <w:tcPr/>
-          <w:p>
-            <w:pPr>
-              <w:pStyle w:val="Compact"/>
-            </w:pPr>
-            <w:r>
-              <w:t xml:space="preserve">2k events/s bursts</w:t>
-            </w:r>
-          </w:p>
-        </w:tc>
-        <w:tc>
-          <w:tcPr/>
-          <w:p>
-            <w:pPr>
-              <w:pStyle w:val="Compact"/>
-            </w:pPr>
-            <w:r>
-              <w:t xml:space="preserve">Per-event Postgres writes from Lambda</w:t>
-            </w:r>
-          </w:p>
-        </w:tc>
-        <w:tc>
-          <w:tcPr/>
-          <w:p>
-            <w:pPr>
-              <w:pStyle w:val="Compact"/>
-            </w:pPr>
-            <w:r>
-              <w:t xml:space="preserve">Micro-batching (already 100/invocation), RDS Proxy; then Flink doing dedupe and version compare before Postgres</w:t>
-            </w:r>
-          </w:p>
-        </w:tc>
-      </w:tr>
-      <w:tr>
-        <w:tc>
-          <w:tcPr/>
-          <w:p>
-            <w:pPr>
-              <w:pStyle w:val="Compact"/>
-            </w:pPr>
-            <w:r>
-              <w:t xml:space="preserve">400 customers, 250k watches</w:t>
-            </w:r>
-          </w:p>
-        </w:tc>
-        <w:tc>
-          <w:tcPr/>
-          <w:p>
-            <w:pPr>
-              <w:pStyle w:val="Compact"/>
-            </w:pPr>
-            <w:r>
-              <w:t xml:space="preserve">Fan-out per event</w:t>
-            </w:r>
-          </w:p>
-        </w:tc>
-        <w:tc>
-          <w:tcPr/>
-          <w:p>
-            <w:pPr>
-              <w:pStyle w:val="Compact"/>
-            </w:pPr>
-            <w:r>
-              <w:t xml:space="preserve">DynamoDB handles it; batch notifications per customer per minute</w:t>
-            </w:r>
-          </w:p>
-        </w:tc>
-      </w:tr>
-      <w:tr>
-        <w:tc>
-          <w:tcPr/>
-          <w:p>
-            <w:pPr>
-              <w:pStyle w:val="Compact"/>
-            </w:pPr>
-            <w:r>
-              <w:t xml:space="preserve">Nightly full export</w:t>
-            </w:r>
-          </w:p>
-        </w:tc>
-        <w:tc>
-          <w:tcPr/>
-          <w:p>
-            <w:pPr>
-              <w:pStyle w:val="Compact"/>
-            </w:pPr>
-            <w:r>
-              <w:t xml:space="preserve">Gets long</w:t>
-            </w:r>
-          </w:p>
-        </w:tc>
-        <w:tc>
-          <w:tcPr/>
-          <w:p>
-            <w:pPr>
-              <w:pStyle w:val="Compact"/>
-            </w:pPr>
-            <w:r>
-              <w:t xml:space="preserve">Incremental export on</w:t>
-            </w:r>
-            <w:r>
-              <w:t xml:space="preserve"> </w:t>
-            </w:r>
-            <w:r>
-              <w:rPr>
-                <w:rStyle w:val="VerbatimChar"/>
-              </w:rPr>
-              <w:t xml:space="preserve">valid_from &gt; last run</w:t>
-            </w:r>
-          </w:p>
-        </w:tc>
-      </w:tr>
-    </w:tbl>
-    <w:p>
-      <w:pPr>
-        <w:pStyle w:val="Heading2"/>
-      </w:pPr>
-      <w:bookmarkStart w:id="49" w:name="_0a0641f445e3e0b4b0daf89f6bc9b9d2d34a50c"/>
-      <w:r>
-        <w:t xml:space="preserve">7. Six weeks with this team</w:t>
-      </w:r>
-      <w:bookmarkEnd w:id="49"/>
-    </w:p>
-    <w:tbl>
-      <w:tblPr>
-        <w:tblStyle w:val="Table"/>
-        <w:tblW w:type="pct" w:w="5000"/>
-        <w:tblLayout w:type="fixed"/>
-        <w:tblLook w:firstRow="1" w:lastRow="0" w:firstColumn="0" w:lastColumn="0" w:noHBand="0" w:noVBand="0" w:val="0020"/>
-      </w:tblPr>
-      <w:tblGrid>
-        <w:gridCol w:w="2640"/>
-        <w:gridCol w:w="2640"/>
-        <w:gridCol w:w="2640"/>
-      </w:tblGrid>
-      <w:tr>
-        <w:trPr>
-          <w:tblHeader w:val="on"/>
-        </w:trPr>
-        <w:tc>
-          <w:tcPr/>
-          <w:p>
-            <w:pPr>
-              <w:pStyle w:val="Compact"/>
-            </w:pPr>
-            <w:r>
-              <w:t xml:space="preserve">Weeks</w:t>
-            </w:r>
-          </w:p>
-        </w:tc>
-        <w:tc>
-          <w:tcPr/>
-          <w:p>
-            <w:pPr>
-              <w:pStyle w:val="Compact"/>
-            </w:pPr>
-            <w:r>
-              <w:t xml:space="preserve">Build</w:t>
-            </w:r>
-          </w:p>
-        </w:tc>
-        <w:tc>
-          <w:tcPr/>
-          <w:p>
-            <w:pPr>
-              <w:pStyle w:val="Compact"/>
-            </w:pPr>
-            <w:r>
-              <w:t xml:space="preserve">Reason</w:t>
-            </w:r>
-          </w:p>
-        </w:tc>
-      </w:tr>
-      <w:tr>
-        <w:tc>
-          <w:tcPr/>
-          <w:p>
-            <w:pPr>
-              <w:pStyle w:val="Compact"/>
-            </w:pPr>
-            <w:r>
-              <w:t xml:space="preserve">1–2</w:t>
-            </w:r>
-          </w:p>
-        </w:tc>
-        <w:tc>
-          <w:tcPr/>
-          <w:p>
-            <w:pPr>
-              <w:pStyle w:val="Compact"/>
-            </w:pPr>
-            <w:r>
-              <w:t xml:space="preserve">Raw landing for all five sources; Postgres model; S1 parse + diff + SCD2; FEI-based sites</w:t>
-            </w:r>
-          </w:p>
-        </w:tc>
-        <w:tc>
-          <w:tcPr/>
-          <w:p>
-            <w:pPr>
-              <w:pStyle w:val="Compact"/>
-            </w:pPr>
-            <w:r>
-              <w:t xml:space="preserve">Landing is append-only and cheap, and history starts accumulating from day one</w:t>
-            </w:r>
-          </w:p>
-        </w:tc>
-      </w:tr>
-      <w:tr>
-        <w:tc>
-          <w:tcPr/>
-          <w:p>
-            <w:pPr>
-              <w:pStyle w:val="Compact"/>
-            </w:pPr>
-            <w:r>
-              <w:t xml:space="preserve">3–4</w:t>
-            </w:r>
-          </w:p>
-        </w:tc>
-        <w:tc>
-          <w:tcPr/>
-          <w:p>
-            <w:pPr>
-              <w:pStyle w:val="Compact"/>
-            </w:pPr>
-            <w:r>
-              <w:t xml:space="preserve">S4 stream apply, DynamoDB watchers, alerts end to end; S5 apply with immediate delete; basic U1 profile</w:t>
-            </w:r>
-          </w:p>
-        </w:tc>
-        <w:tc>
-          <w:tcPr/>
-          <w:p>
-            <w:pPr>
-              <w:pStyle w:val="Compact"/>
-            </w:pPr>
-            <w:r>
-              <w:t xml:space="preserve">Alerts are what customers pay for</w:t>
-            </w:r>
-          </w:p>
-        </w:tc>
-      </w:tr>
-      <w:tr>
-        <w:tc>
-          <w:tcPr/>
-          <w:p>
-            <w:pPr>
-              <w:pStyle w:val="Compact"/>
-            </w:pPr>
-            <w:r>
-              <w:t xml:space="preserve">5–6</w:t>
-            </w:r>
-          </w:p>
-        </w:tc>
-        <w:tc>
-          <w:tcPr/>
-          <w:p>
-            <w:pPr>
-              <w:pStyle w:val="Compact"/>
-            </w:pPr>
-            <w:r>
-              <w:t xml:space="preserve">ER library with the three bands and a bare review table; S3 letters into Postgres and OpenSearch; quarantine + the five monitors</w:t>
-            </w:r>
-          </w:p>
-        </w:tc>
-        <w:tc>
-          <w:tcPr/>
-          <w:p>
-            <w:pPr>
-              <w:pStyle w:val="Compact"/>
-            </w:pPr>
-            <w:r>
-              <w:t xml:space="preserve">Quality tooling improves a product that already exists</w:t>
-            </w:r>
-          </w:p>
-        </w:tc>
-      </w:tr>
-    </w:tbl>
-    <w:p>
-      <w:pPr>
-        <w:pStyle w:val="FirstParagraph"/>
-      </w:pPr>
-      <w:r>
-        <w:rPr>
-          <w:b/>
-          <w:bCs/>
-        </w:rPr>
-        <w:t xml:space="preserve">Deliberately deferred:</w:t>
-      </w:r>
-      <w:r>
-        <w:t xml:space="preserve"> </w:t>
-      </w:r>
-      <w:r>
-        <w:t xml:space="preserve">S2 (monthly; week 7 loses nothing), NLP tagging (search works without it), Snowflake marts (U4 can be served from Postgres for 40 customers), a steward UI (a table and two SQL functions suffice for one steward), geocoding, the 15-year backfill (needs a stable pipeline; raw landing from day one means we lose nothing by waiting).</w:t>
-      </w:r>
-    </w:p>
-    <w:p>
-      <w:r>
-        <w:br w:type="page"/>
-      </w:r>
-    </w:p>
-    <w:p>
-      <w:pPr>
-        <w:pStyle w:val="Heading1"/>
-      </w:pPr>
-      <w:bookmarkStart w:id="50" w:name="_62599194d5a392fee9acfc2cac13209c91afdf4"/>
-      <w:r>
-        <w:t xml:space="preserve">Assumptions, AI usage, time spent</w:t>
-      </w:r>
-      <w:bookmarkEnd w:id="50"/>
-    </w:p>
-    <w:p>
-      <w:pPr>
-        <w:pStyle w:val="Heading2"/>
-      </w:pPr>
-      <w:bookmarkStart w:id="51" w:name="_assumptions"/>
-      <w:r>
-        <w:t xml:space="preserve">Assumptions</w:t>
-      </w:r>
-      <w:bookmarkEnd w:id="51"/>
-    </w:p>
-    <w:p>
-      <w:pPr>
-        <w:pStyle w:val="FirstParagraph"/>
-      </w:pPr>
-      <w:r>
-        <w:t xml:space="preserve">Where the brief was silent or ambiguous, I assumed the following.</w:t>
+        <w:t xml:space="preserve">I used Claude Code (Anthropic) as a design partner throughout, in one working session.</w:t>
       </w:r>
     </w:p>
     <w:p>
@@ -14512,40 +14669,13 @@
           <w:b/>
           <w:bCs/>
         </w:rPr>
-        <w:t xml:space="preserve">S1 dates</w:t>
-      </w:r>
-      <w:r>
-        <w:t xml:space="preserve"> </w:t>
-      </w:r>
-      <w:r>
-        <w:t xml:space="preserve">parse as ISO first, otherwise</w:t>
-      </w:r>
-      <w:r>
-        <w:t xml:space="preserve"> </w:t>
-      </w:r>
-      <w:r>
-        <w:rPr>
-          <w:rStyle w:val="VerbatimChar"/>
-        </w:rPr>
-        <w:t xml:space="preserve">MM/DD/YYYY</w:t>
-      </w:r>
-      <w:r>
-        <w:t xml:space="preserve">;</w:t>
-      </w:r>
-      <w:r>
-        <w:t xml:space="preserve"> </w:t>
-      </w:r>
-      <w:r>
-        <w:rPr>
-          <w:rStyle w:val="VerbatimChar"/>
-        </w:rPr>
-        <w:t xml:space="preserve">08/02/2026</w:t>
-      </w:r>
-      <w:r>
-        <w:t xml:space="preserve"> </w:t>
-      </w:r>
-      <w:r>
-        <w:t xml:space="preserve">is 2 August 2026. The original string is kept so the rule can change without re-fetching.</w:t>
+        <w:t xml:space="preserve">Mine:</w:t>
+      </w:r>
+      <w:r>
+        <w:t xml:space="preserve"> </w:t>
+      </w:r>
+      <w:r>
+        <w:t xml:space="preserve">reading the brief; the core modelling idea (facts keep agency identifiers, a versioned bridge maps them to our sites, merges change the bridge and never the facts); choosing PostgreSQL as the operational system of record over Snowflake after weighing both; deciding where to go deep (identity, history, S4 handling) and where to stay shallow; removing tables I could not justify (a separate decision log, a raw-event table, a source dimension); pushing until every table could be explained in plain language.</w:t>
       </w:r>
     </w:p>
     <w:p>
@@ -14561,10 +14691,13 @@
           <w:b/>
           <w:bCs/>
         </w:rPr>
-        <w:t xml:space="preserve">S1/S2 snapshots are complete</w:t>
-      </w:r>
-      <w:r>
-        <w:t xml:space="preserve">: a row missing from the new snapshot is a retraction. A retraction rate above 2% is treated as a bad file and quarantined instead.</w:t>
+        <w:t xml:space="preserve">Claude’s:</w:t>
+      </w:r>
+      <w:r>
+        <w:t xml:space="preserve"> </w:t>
+      </w:r>
+      <w:r>
+        <w:t xml:space="preserve">turning those decisions into DDL, diagrams and written sections; drafting Parts B, C and D for me to edit; generating the sample-data SQL from the brief; running the DDL, sample data and the U2/U3/U4 queries on a local PostgreSQL 17 and capturing the output; catching my misunderstandings (source vs store, engine vs store) and correcting its own (an overstated claim about Snowflake transactions, fixed in Part B).</w:t>
       </w:r>
     </w:p>
     <w:p>
@@ -14580,335 +14713,32 @@
           <w:b/>
           <w:bCs/>
         </w:rPr>
-        <w:t xml:space="preserve">S2</w:t>
-      </w:r>
-      <w:r>
-        <w:rPr>
-          <w:b/>
-          <w:bCs/>
-        </w:rPr>
-        <w:t xml:space="preserve"> </w:t>
-      </w:r>
-      <w:r>
-        <w:rPr>
-          <w:rStyle w:val="VerbatimChar"/>
-          <w:b/>
-          <w:bCs/>
-        </w:rPr>
-        <w:t xml:space="preserve">WITHDRAWN</w:t>
-      </w:r>
-      <w:r>
-        <w:t xml:space="preserve"> </w:t>
-      </w:r>
-      <w:r>
-        <w:t xml:space="preserve">is a correction (new version), not a retraction: the document still exists. In-file duplicates are identical copies and are dropped before diffing.</w:t>
+        <w:t xml:space="preserve">Verified:</w:t>
+      </w:r>
+      <w:r>
+        <w:t xml:space="preserve"> </w:t>
+      </w:r>
+      <w:r>
+        <w:t xml:space="preserve">all DDL and queries were executed on PostgreSQL 17 with the brief’s sample rows; results are in the appendix (U3 returns VAI for 2026-10-08 and OAI for 2026-10-13; U2 returns cust_042; the duplicate S4 event is a no-op).</w:t>
       </w:r>
     </w:p>
     <w:p>
       <w:pPr>
-        <w:pStyle w:val="Compact"/>
-        <w:numPr>
-          <w:ilvl w:val="0"/>
-          <w:numId w:val="1010"/>
-        </w:numPr>
+        <w:pStyle w:val="FirstParagraph"/>
       </w:pPr>
       <w:r>
-        <w:rPr>
-          <w:b/>
-          <w:bCs/>
-        </w:rPr>
-        <w:t xml:space="preserve">S4</w:t>
-      </w:r>
-      <w:r>
-        <w:rPr>
-          <w:b/>
-          <w:bCs/>
-        </w:rPr>
-        <w:t xml:space="preserve"> </w:t>
-      </w:r>
-      <w:r>
-        <w:rPr>
-          <w:rStyle w:val="VerbatimChar"/>
-          <w:b/>
-          <w:bCs/>
-        </w:rPr>
-        <w:t xml:space="preserve">version</w:t>
-      </w:r>
-      <w:r>
-        <w:t xml:space="preserve"> </w:t>
-      </w:r>
-      <w:r>
-        <w:t xml:space="preserve">is monotonically increasing per</w:t>
-      </w:r>
-      <w:r>
-        <w:t xml:space="preserve"> </w:t>
-      </w:r>
-      <w:r>
-        <w:rPr>
-          <w:rStyle w:val="VerbatimChar"/>
-        </w:rPr>
-        <w:t xml:space="preserve">action_id</w:t>
-      </w:r>
-      <w:r>
-        <w:t xml:space="preserve"> </w:t>
-      </w:r>
-      <w:r>
-        <w:t xml:space="preserve">and is the authoritative order. A RETRACT for an action never seen is stored as a tombstone and queued for review, not alerted (it carries no FEI). An unknown</w:t>
-      </w:r>
-      <w:r>
-        <w:t xml:space="preserve"> </w:t>
-      </w:r>
-      <w:r>
-        <w:rPr>
-          <w:rStyle w:val="VerbatimChar"/>
-        </w:rPr>
-        <w:t xml:space="preserve">schema_version</w:t>
-      </w:r>
-      <w:r>
-        <w:t xml:space="preserve"> </w:t>
-      </w:r>
-      <w:r>
-        <w:t xml:space="preserve">goes to a dead-letter queue rather than being parsed on a best-effort basis.</w:t>
-      </w:r>
-    </w:p>
-    <w:p>
-      <w:pPr>
-        <w:pStyle w:val="Compact"/>
-        <w:numPr>
-          <w:ilvl w:val="0"/>
-          <w:numId w:val="1010"/>
-        </w:numPr>
-      </w:pPr>
-      <w:r>
-        <w:rPr>
-          <w:b/>
-          <w:bCs/>
-        </w:rPr>
-        <w:t xml:space="preserve">S5 CDC</w:t>
-      </w:r>
-      <w:r>
-        <w:t xml:space="preserve"> </w:t>
-      </w:r>
-      <w:r>
-        <w:t xml:space="preserve">is produced by the customer-app team (Debezium on their PostgreSQL); we consume a topic and never connect to their database.</w:t>
-      </w:r>
-    </w:p>
-    <w:p>
-      <w:pPr>
-        <w:pStyle w:val="Compact"/>
-        <w:numPr>
-          <w:ilvl w:val="0"/>
-          <w:numId w:val="1010"/>
-        </w:numPr>
-      </w:pPr>
-      <w:r>
-        <w:rPr>
-          <w:b/>
-          <w:bCs/>
-        </w:rPr>
-        <w:t xml:space="preserve">Within one agency the agency’s ID is authoritative</w:t>
-      </w:r>
-      <w:r>
-        <w:t xml:space="preserve">: same FEI = same site. Cross-agency matching auto-links at ≥ 0.95, sends 0.75–0.95 to a human, creates a new site below 0.75. Thresholds are a starting point to be tuned on steward decisions. At least one part-time steward is available.</w:t>
-      </w:r>
-    </w:p>
-    <w:p>
-      <w:pPr>
-        <w:pStyle w:val="Compact"/>
-        <w:numPr>
-          <w:ilvl w:val="0"/>
-          <w:numId w:val="1010"/>
-        </w:numPr>
-      </w:pPr>
-      <w:r>
-        <w:rPr>
-          <w:b/>
-          <w:bCs/>
-        </w:rPr>
-        <w:t xml:space="preserve">“New or changed”</w:t>
-      </w:r>
-      <w:r>
-        <w:rPr>
-          <w:b/>
-          <w:bCs/>
-        </w:rPr>
-        <w:t xml:space="preserve"> </w:t>
-      </w:r>
-      <w:r>
-        <w:rPr>
-          <w:b/>
-          <w:bCs/>
-        </w:rPr>
-        <w:t xml:space="preserve">enforcement action includes a RETRACT</w:t>
-      </w:r>
-      <w:r>
-        <w:t xml:space="preserve">: customers told about an action are told when it is withdrawn.</w:t>
-      </w:r>
-    </w:p>
-    <w:p>
-      <w:pPr>
-        <w:pStyle w:val="Compact"/>
-        <w:numPr>
-          <w:ilvl w:val="0"/>
-          <w:numId w:val="1010"/>
-        </w:numPr>
-      </w:pPr>
-      <w:r>
-        <w:rPr>
-          <w:b/>
-          <w:bCs/>
-        </w:rPr>
-        <w:t xml:space="preserve">The customer app reads site profiles from the model</w:t>
-      </w:r>
-      <w:r>
-        <w:t xml:space="preserve"> </w:t>
-      </w:r>
-      <w:r>
-        <w:t xml:space="preserve">via an API, which is why the model needs an OLTP store (Part B §5 states when that would change).</w:t>
-      </w:r>
-    </w:p>
-    <w:p>
-      <w:pPr>
-        <w:pStyle w:val="Compact"/>
-        <w:numPr>
-          <w:ilvl w:val="0"/>
-          <w:numId w:val="1010"/>
-        </w:numPr>
-      </w:pPr>
-      <w:r>
-        <w:rPr>
-          <w:b/>
-          <w:bCs/>
-        </w:rPr>
-        <w:t xml:space="preserve">15-year historical snapshots can be obtained</w:t>
-      </w:r>
-      <w:r>
-        <w:t xml:space="preserve"> </w:t>
-      </w:r>
-      <w:r>
-        <w:t xml:space="preserve">for S1 and S2. If only current state is available, history starts at go-live, flagged as such.</w:t>
-      </w:r>
-    </w:p>
-    <w:p>
-      <w:pPr>
-        <w:pStyle w:val="Compact"/>
-        <w:numPr>
-          <w:ilvl w:val="0"/>
-          <w:numId w:val="1010"/>
-        </w:numPr>
-      </w:pPr>
-      <w:r>
-        <w:rPr>
-          <w:b/>
-          <w:bCs/>
-        </w:rPr>
-        <w:t xml:space="preserve">Infrastructure is AWS</w:t>
-      </w:r>
-      <w:r>
-        <w:t xml:space="preserve">, one region, our account separate from the customer app’s.</w:t>
+        <w:t xml:space="preserve">Every design choice in this document is one I can explain and defend without the tool.</w:t>
       </w:r>
     </w:p>
     <w:p>
       <w:pPr>
         <w:pStyle w:val="Heading2"/>
       </w:pPr>
-      <w:bookmarkStart w:id="52" w:name="_63249b6f657b864a327a7fc992cdbb6ebaad32c"/>
-      <w:r>
-        <w:t xml:space="preserve">How AI tools were used</w:t>
-      </w:r>
-      <w:bookmarkEnd w:id="52"/>
-    </w:p>
-    <w:p>
-      <w:pPr>
-        <w:pStyle w:val="FirstParagraph"/>
-      </w:pPr>
-      <w:r>
-        <w:t xml:space="preserve">I used Claude Code (Anthropic) as a design partner throughout, in one working session.</w:t>
-      </w:r>
-    </w:p>
-    <w:p>
-      <w:pPr>
-        <w:pStyle w:val="Compact"/>
-        <w:numPr>
-          <w:ilvl w:val="0"/>
-          <w:numId w:val="1011"/>
-        </w:numPr>
-      </w:pPr>
-      <w:r>
-        <w:rPr>
-          <w:b/>
-          <w:bCs/>
-        </w:rPr>
-        <w:t xml:space="preserve">Mine:</w:t>
-      </w:r>
-      <w:r>
-        <w:t xml:space="preserve"> </w:t>
-      </w:r>
-      <w:r>
-        <w:t xml:space="preserve">reading the brief; the core modelling idea (facts keep agency identifiers, a versioned bridge maps them to our sites, merges change the bridge and never the facts); choosing PostgreSQL as the operational system of record over Snowflake after weighing both; deciding where to go deep (identity, history, S4 handling) and where to stay shallow; removing tables I could not justify (a separate decision log, a raw-event table, a source dimension); pushing until every table could be explained in plain language.</w:t>
-      </w:r>
-    </w:p>
-    <w:p>
-      <w:pPr>
-        <w:pStyle w:val="Compact"/>
-        <w:numPr>
-          <w:ilvl w:val="0"/>
-          <w:numId w:val="1011"/>
-        </w:numPr>
-      </w:pPr>
-      <w:r>
-        <w:rPr>
-          <w:b/>
-          <w:bCs/>
-        </w:rPr>
-        <w:t xml:space="preserve">Claude’s:</w:t>
-      </w:r>
-      <w:r>
-        <w:t xml:space="preserve"> </w:t>
-      </w:r>
-      <w:r>
-        <w:t xml:space="preserve">turning those decisions into DDL, diagrams and written sections; drafting Parts B, C and D for me to edit; generating the sample-data SQL from the brief; running the DDL, sample data and the U2/U3/U4 queries on a local PostgreSQL 17 and capturing the output; catching my misunderstandings (source vs store, engine vs store) and correcting its own (an overstated claim about Snowflake transactions, fixed in Part B).</w:t>
-      </w:r>
-    </w:p>
-    <w:p>
-      <w:pPr>
-        <w:pStyle w:val="Compact"/>
-        <w:numPr>
-          <w:ilvl w:val="0"/>
-          <w:numId w:val="1011"/>
-        </w:numPr>
-      </w:pPr>
-      <w:r>
-        <w:rPr>
-          <w:b/>
-          <w:bCs/>
-        </w:rPr>
-        <w:t xml:space="preserve">Verified:</w:t>
-      </w:r>
-      <w:r>
-        <w:t xml:space="preserve"> </w:t>
-      </w:r>
-      <w:r>
-        <w:t xml:space="preserve">all DDL and queries were executed on PostgreSQL 17 with the brief’s sample rows; results are in the appendix (U3 returns VAI for 2026-10-08 and OAI for 2026-10-13; U2 returns cust_042; the duplicate S4 event is a no-op).</w:t>
-      </w:r>
-    </w:p>
-    <w:p>
-      <w:pPr>
-        <w:pStyle w:val="FirstParagraph"/>
-      </w:pPr>
-      <w:r>
-        <w:t xml:space="preserve">Every design choice in this document is one I can explain and defend without the tool.</w:t>
-      </w:r>
-    </w:p>
-    <w:p>
-      <w:pPr>
-        <w:pStyle w:val="Heading2"/>
-      </w:pPr>
-      <w:bookmarkStart w:id="53" w:name="_4707a072b6f3d5b20db6874a789343aaa47f503"/>
+      <w:bookmarkStart w:id="50" w:name="_4707a072b6f3d5b20db6874a789343aaa47f503"/>
       <w:r>
         <w:t xml:space="preserve">Time spent</w:t>
       </w:r>
-      <w:bookmarkEnd w:id="53"/>
+      <w:bookmarkEnd w:id="50"/>
     </w:p>
     <w:p>
       <w:pPr>
@@ -15296,9 +15126,6 @@
     <w:abstractNumId w:val="991"/>
   </w:num>
   <w:num w:numId="1004">
-    <w:abstractNumId w:val="991"/>
-  </w:num>
-  <w:num w:numId="1005">
     <w:abstractNumId w:val="99411"/>
     <w:lvlOverride w:ilvl="0">
       <w:startOverride w:val="1"/>
@@ -15328,8 +15155,38 @@
       <w:startOverride w:val="1"/>
     </w:lvlOverride>
   </w:num>
+  <w:num w:numId="1005">
+    <w:abstractNumId w:val="991"/>
+  </w:num>
   <w:num w:numId="1006">
-    <w:abstractNumId w:val="991"/>
+    <w:abstractNumId w:val="99411"/>
+    <w:lvlOverride w:ilvl="0">
+      <w:startOverride w:val="1"/>
+    </w:lvlOverride>
+    <w:lvlOverride w:ilvl="1">
+      <w:startOverride w:val="1"/>
+    </w:lvlOverride>
+    <w:lvlOverride w:ilvl="2">
+      <w:startOverride w:val="1"/>
+    </w:lvlOverride>
+    <w:lvlOverride w:ilvl="3">
+      <w:startOverride w:val="1"/>
+    </w:lvlOverride>
+    <w:lvlOverride w:ilvl="4">
+      <w:startOverride w:val="1"/>
+    </w:lvlOverride>
+    <w:lvlOverride w:ilvl="5">
+      <w:startOverride w:val="1"/>
+    </w:lvlOverride>
+    <w:lvlOverride w:ilvl="6">
+      <w:startOverride w:val="1"/>
+    </w:lvlOverride>
+    <w:lvlOverride w:ilvl="7">
+      <w:startOverride w:val="1"/>
+    </w:lvlOverride>
+    <w:lvlOverride w:ilvl="8">
+      <w:startOverride w:val="1"/>
+    </w:lvlOverride>
   </w:num>
   <w:num w:numId="1007">
     <w:abstractNumId w:val="99411"/>
@@ -15422,36 +15279,6 @@
     </w:lvlOverride>
   </w:num>
   <w:num w:numId="1010">
-    <w:abstractNumId w:val="99411"/>
-    <w:lvlOverride w:ilvl="0">
-      <w:startOverride w:val="1"/>
-    </w:lvlOverride>
-    <w:lvlOverride w:ilvl="1">
-      <w:startOverride w:val="1"/>
-    </w:lvlOverride>
-    <w:lvlOverride w:ilvl="2">
-      <w:startOverride w:val="1"/>
-    </w:lvlOverride>
-    <w:lvlOverride w:ilvl="3">
-      <w:startOverride w:val="1"/>
-    </w:lvlOverride>
-    <w:lvlOverride w:ilvl="4">
-      <w:startOverride w:val="1"/>
-    </w:lvlOverride>
-    <w:lvlOverride w:ilvl="5">
-      <w:startOverride w:val="1"/>
-    </w:lvlOverride>
-    <w:lvlOverride w:ilvl="6">
-      <w:startOverride w:val="1"/>
-    </w:lvlOverride>
-    <w:lvlOverride w:ilvl="7">
-      <w:startOverride w:val="1"/>
-    </w:lvlOverride>
-    <w:lvlOverride w:ilvl="8">
-      <w:startOverride w:val="1"/>
-    </w:lvlOverride>
-  </w:num>
-  <w:num w:numId="1011">
     <w:abstractNumId w:val="991"/>
   </w:num>
 </w:numbering>

</xml_diff>

<commit_message>
Time spent 3.5-4 h; restore a compact rejected-alternative section; trim AI-usage note
Co-Authored-By: Claude Fable 5.1 <noreply@anthropic.com>
</commit_message>
<xml_diff>
--- a/SUBMISSION.docx
+++ b/SUBMISSION.docx
@@ -8534,7 +8534,7 @@
         <w:t xml:space="preserve"> </w:t>
       </w:r>
       <w:r>
-        <w:t xml:space="preserve">One more database than the alternative I weighed seriously, Snowflake as the sole system of record (S3 → Snowpipe → dbt snapshots → marts, DynamoDB for alerts). Accepted because the brief ranks a wrong merge as the worst outcome, and</w:t>
+        <w:t xml:space="preserve">One more database than a Snowflake-only design (§5). Accepted because the brief ranks a wrong merge as the worst outcome, and</w:t>
       </w:r>
       <w:r>
         <w:t xml:space="preserve"> </w:t>
@@ -8555,7 +8555,7 @@
         <w:t xml:space="preserve">“a test would have caught it”</w:t>
       </w:r>
       <w:r>
-        <w:t xml:space="preserve">; I would revisit it if the app stopped reading the model directly. Engines (Flink, Spark) are a separate question from stores; at today’s volumes they add a 24/7 cost without changing the design, so processing is SQL, Python on Fargate, and Lambda. They are the upgrade path at 10x.</w:t>
+        <w:t xml:space="preserve">. Engines (Flink, Spark) are a separate question from stores; at today’s volumes they add a 24/7 cost without changing the design, so processing is SQL, Python on Fargate, and Lambda. They are the upgrade path at 10x.</w:t>
       </w:r>
     </w:p>
     <w:p>
@@ -9725,6 +9725,31 @@
     </w:p>
     <w:p>
       <w:pPr>
+        <w:pStyle w:val="Heading2"/>
+      </w:pPr>
+      <w:bookmarkStart w:id="27" w:name="_63a66e935e45a40fff4a8a7effe86c0981a901c"/>
+      <w:r>
+        <w:t xml:space="preserve">5. Alternative considered and rejected</w:t>
+      </w:r>
+      <w:bookmarkEnd w:id="27"/>
+    </w:p>
+    <w:p>
+      <w:pPr>
+        <w:pStyle w:val="FirstParagraph"/>
+      </w:pPr>
+      <w:r>
+        <w:rPr>
+          <w:b/>
+          <w:bCs/>
+        </w:rPr>
+        <w:t xml:space="preserve">Snowflake as the sole system of record</w:t>
+      </w:r>
+      <w:r>
+        <w:t xml:space="preserve">: S3 → Snowpipe → staging → dbt snapshots for SCD2 → marts, with DynamoDB for watchers and alerts. All on the stated stack, one database fewer. Rejected because (1) the one-identifier-one-site rule and the primary keys are declared but not enforced in a warehouse, so a bad matching run corrupts the bridge silently; (2) the customer app reads the model for U1, and a warehouse serving sub-second reads must stay running; (3) S4/S5 are thousands of small per-event writes, which a columnar engine handles poorly. I would revisit it if the app stopped reading the model directly and the stream path wrote only to DynamoDB; the DDL is the same, constraints become tests.</w:t>
+      </w:r>
+    </w:p>
+    <w:p>
+      <w:pPr>
         <w:sectPr>
           <w:pgSz w:w="11906" w:h="16838"/>
           <w:pgMar w:top="850" w:right="850" w:bottom="850" w:left="850" w:header="567" w:footer="567" w:gutter="0"/>
@@ -9740,21 +9765,21 @@
       <w:pPr>
         <w:pStyle w:val="Heading1"/>
       </w:pPr>
-      <w:bookmarkStart w:id="27" w:name="_c3bdf1e69419d5864c443e9dbf78f8207a09f4e"/>
+      <w:bookmarkStart w:id="28" w:name="_c3bdf1e69419d5864c443e9dbf78f8207a09f4e"/>
       <w:r>
         <w:t xml:space="preserve">Part C — Pipeline architecture</w:t>
       </w:r>
-      <w:bookmarkEnd w:id="27"/>
+      <w:bookmarkEnd w:id="28"/>
     </w:p>
     <w:p>
       <w:pPr>
         <w:pStyle w:val="Heading2"/>
       </w:pPr>
-      <w:bookmarkStart w:id="28" w:name="_diagram"/>
+      <w:bookmarkStart w:id="29" w:name="_diagram"/>
       <w:r>
         <w:t xml:space="preserve">Diagram</w:t>
       </w:r>
-      <w:bookmarkEnd w:id="28"/>
+      <w:bookmarkEnd w:id="29"/>
     </w:p>
     <w:p>
       <w:pPr>
@@ -9765,18 +9790,18 @@
           <wp:inline>
             <wp:extent cx="9720000" cy="4078928"/>
             <wp:effectExtent b="0" l="0" r="0" t="0"/>
-            <wp:docPr descr="Pipeline" title="" id="30" name="Picture"/>
+            <wp:docPr descr="Pipeline" title="" id="31" name="Picture"/>
             <a:graphic>
               <a:graphicData uri="http://schemas.openxmlformats.org/drawingml/2006/picture">
                 <pic:pic>
                   <pic:nvPicPr>
-                    <pic:cNvPr descr="diagrams/pipeline.png" id="31" name="Picture"/>
+                    <pic:cNvPr descr="diagrams/pipeline.png" id="32" name="Picture"/>
                     <pic:cNvPicPr>
                       <a:picLocks noChangeArrowheads="1" noChangeAspect="1"/>
                     </pic:cNvPicPr>
                   </pic:nvPicPr>
                   <pic:blipFill>
-                    <a:blip r:embed="rId29"/>
+                    <a:blip r:embed="rId30"/>
                     <a:stretch>
                       <a:fillRect/>
                     </a:stretch>
@@ -9839,11 +9864,11 @@
       <w:pPr>
         <w:pStyle w:val="Heading2"/>
       </w:pPr>
-      <w:bookmarkStart w:id="32" w:name="_4ff6536d3fb179ed45543c09917e315dd11e6c4"/>
+      <w:bookmarkStart w:id="33" w:name="_4ff6536d3fb179ed45543c09917e315dd11e6c4"/>
       <w:r>
         <w:t xml:space="preserve">Components and triggers</w:t>
       </w:r>
-      <w:bookmarkEnd w:id="32"/>
+      <w:bookmarkEnd w:id="33"/>
     </w:p>
     <w:tbl>
       <w:tblPr>
@@ -10838,21 +10863,21 @@
       <w:pPr>
         <w:pStyle w:val="Heading2"/>
       </w:pPr>
-      <w:bookmarkStart w:id="33" w:name="_walkthroughs"/>
+      <w:bookmarkStart w:id="34" w:name="_walkthroughs"/>
       <w:r>
         <w:t xml:space="preserve">Walkthroughs</w:t>
       </w:r>
-      <w:bookmarkEnd w:id="33"/>
+      <w:bookmarkEnd w:id="34"/>
     </w:p>
     <w:p>
       <w:pPr>
         <w:pStyle w:val="Heading3"/>
       </w:pPr>
-      <w:bookmarkStart w:id="34" w:name="_e77a1fbb8cbd66895cf6cf846783b264295ec04"/>
+      <w:bookmarkStart w:id="35" w:name="_e77a1fbb8cbd66895cf6cf846783b264295ec04"/>
       <w:r>
         <w:t xml:space="preserve">a. The S1 weekly snapshot (corrections and retractions)</w:t>
       </w:r>
-      <w:bookmarkEnd w:id="34"/>
+      <w:bookmarkEnd w:id="35"/>
     </w:p>
     <w:p>
       <w:pPr>
@@ -11098,11 +11123,11 @@
       <w:pPr>
         <w:pStyle w:val="Heading3"/>
       </w:pPr>
-      <w:bookmarkStart w:id="35" w:name="_7d1b76e018cf3419e042eead3128e91b930648a"/>
+      <w:bookmarkStart w:id="36" w:name="_7d1b76e018cf3419e042eead3128e91b930648a"/>
       <w:r>
         <w:t xml:space="preserve">b. The four S4 events, in arrival order</w:t>
       </w:r>
-      <w:bookmarkEnd w:id="35"/>
+      <w:bookmarkEnd w:id="36"/>
     </w:p>
     <w:tbl>
       <w:tblPr>
@@ -11466,11 +11491,11 @@
       <w:pPr>
         <w:pStyle w:val="Heading3"/>
       </w:pPr>
-      <w:bookmarkStart w:id="36" w:name="_a94c93838125ef978f7b4e2b6839029937e9069"/>
+      <w:bookmarkStart w:id="37" w:name="_a94c93838125ef978f7b4e2b6839029937e9069"/>
       <w:r>
         <w:t xml:space="preserve">c. A new S3 warning letter</w:t>
       </w:r>
-      <w:bookmarkEnd w:id="36"/>
+      <w:bookmarkEnd w:id="37"/>
     </w:p>
     <w:p>
       <w:pPr>
@@ -11759,11 +11784,11 @@
       <w:pPr>
         <w:pStyle w:val="Heading3"/>
       </w:pPr>
-      <w:bookmarkStart w:id="37" w:name="_358f456af0bfc39c92bdfbc08ca513ade6ee64d"/>
+      <w:bookmarkStart w:id="38" w:name="_358f456af0bfc39c92bdfbc08ca513ade6ee64d"/>
       <w:r>
         <w:t xml:space="preserve">d. An S5 watchlist delete</w:t>
       </w:r>
-      <w:bookmarkEnd w:id="37"/>
+      <w:bookmarkEnd w:id="38"/>
     </w:p>
     <w:p>
       <w:pPr>
@@ -11949,21 +11974,21 @@
       <w:pPr>
         <w:pStyle w:val="Heading1"/>
       </w:pPr>
-      <w:bookmarkStart w:id="38" w:name="_f0b3c50ff5029ee5f7258b7c6a65e7d0dea5495"/>
+      <w:bookmarkStart w:id="39" w:name="_f0b3c50ff5029ee5f7258b7c6a65e7d0dea5495"/>
       <w:r>
         <w:t xml:space="preserve">Part D — Pipeline rationale</w:t>
       </w:r>
-      <w:bookmarkEnd w:id="38"/>
+      <w:bookmarkEnd w:id="39"/>
     </w:p>
     <w:p>
       <w:pPr>
         <w:pStyle w:val="Heading2"/>
       </w:pPr>
-      <w:bookmarkStart w:id="39" w:name="_f0745c3d1c4022d5d540818a18a81b9e96eebff"/>
+      <w:bookmarkStart w:id="40" w:name="_f0745c3d1c4022d5d540818a18a81b9e96eebff"/>
       <w:r>
         <w:t xml:space="preserve">1. Batch and streaming: split by source, unified by store</w:t>
       </w:r>
-      <w:bookmarkEnd w:id="39"/>
+      <w:bookmarkEnd w:id="40"/>
     </w:p>
     <w:p>
       <w:pPr>
@@ -12039,11 +12064,11 @@
       <w:pPr>
         <w:pStyle w:val="Heading2"/>
       </w:pPr>
-      <w:bookmarkStart w:id="40" w:name="_ba4ca068f9f2278321cf9fea3035a5a0212e00c"/>
+      <w:bookmarkStart w:id="41" w:name="_ba4ca068f9f2278321cf9fea3035a5a0212e00c"/>
       <w:r>
         <w:t xml:space="preserve">2. Correctness under duplicates, disorder, late data, schema change</w:t>
       </w:r>
-      <w:bookmarkEnd w:id="40"/>
+      <w:bookmarkEnd w:id="41"/>
     </w:p>
     <w:tbl>
       <w:tblPr>
@@ -12488,11 +12513,11 @@
       <w:pPr>
         <w:pStyle w:val="Heading2"/>
       </w:pPr>
-      <w:bookmarkStart w:id="41" w:name="_fb02abff04cfcbef03378580a607d4db5648cf4"/>
+      <w:bookmarkStart w:id="42" w:name="_fb02abff04cfcbef03378580a607d4db5648cf4"/>
       <w:r>
         <w:t xml:space="preserve">3. Reprocessing and backfill</w:t>
       </w:r>
-      <w:bookmarkEnd w:id="41"/>
+      <w:bookmarkEnd w:id="42"/>
     </w:p>
     <w:p>
       <w:pPr>
@@ -12606,11 +12631,11 @@
       <w:pPr>
         <w:pStyle w:val="Heading2"/>
       </w:pPr>
-      <w:bookmarkStart w:id="42" w:name="_c425f7133e41882dd94f4839905930029452f17"/>
+      <w:bookmarkStart w:id="43" w:name="_c425f7133e41882dd94f4839905930029452f17"/>
       <w:r>
         <w:t xml:space="preserve">4. Data quality</w:t>
       </w:r>
-      <w:bookmarkEnd w:id="42"/>
+      <w:bookmarkEnd w:id="43"/>
     </w:p>
     <w:tbl>
       <w:tblPr>
@@ -12944,11 +12969,11 @@
       <w:pPr>
         <w:pStyle w:val="Heading2"/>
       </w:pPr>
-      <w:bookmarkStart w:id="43" w:name="_d7639c8214e0261c2749d1c2e48a6268315f029"/>
+      <w:bookmarkStart w:id="44" w:name="_d7639c8214e0261c2749d1c2e48a6268315f029"/>
       <w:r>
         <w:t xml:space="preserve">5. Monitoring: the first five signals</w:t>
       </w:r>
-      <w:bookmarkEnd w:id="43"/>
+      <w:bookmarkEnd w:id="44"/>
     </w:p>
     <w:p>
       <w:pPr>
@@ -13116,300 +13141,9 @@
       <w:pPr>
         <w:pStyle w:val="Heading2"/>
       </w:pPr>
-      <w:bookmarkStart w:id="44" w:name="_98dbc4c4769492444eac6d3d5f1901a6e73ba88"/>
+      <w:bookmarkStart w:id="45" w:name="_98dbc4c4769492444eac6d3d5f1901a6e73ba88"/>
       <w:r>
         <w:t xml:space="preserve">6. What breaks first at 10x</w:t>
-      </w:r>
-      <w:bookmarkEnd w:id="44"/>
-    </w:p>
-    <w:tbl>
-      <w:tblPr>
-        <w:tblStyle w:val="Table"/>
-        <w:tblW w:type="pct" w:w="5000"/>
-        <w:tblLayout w:type="fixed"/>
-        <w:tblLook w:firstRow="1" w:lastRow="0" w:firstColumn="0" w:lastColumn="0" w:noHBand="0" w:noVBand="0" w:val="0020"/>
-      </w:tblPr>
-      <w:tblGrid>
-        <w:gridCol w:w="2640"/>
-        <w:gridCol w:w="2640"/>
-        <w:gridCol w:w="2640"/>
-      </w:tblGrid>
-      <w:tr>
-        <w:trPr>
-          <w:tblHeader w:val="on"/>
-        </w:trPr>
-        <w:tc>
-          <w:tcPr/>
-          <w:p>
-            <w:pPr>
-              <w:pStyle w:val="Compact"/>
-            </w:pPr>
-            <w:r>
-              <w:t xml:space="preserve">Pressure</w:t>
-            </w:r>
-          </w:p>
-        </w:tc>
-        <w:tc>
-          <w:tcPr/>
-          <w:p>
-            <w:pPr>
-              <w:pStyle w:val="Compact"/>
-            </w:pPr>
-            <w:r>
-              <w:t xml:space="preserve">Breaks</w:t>
-            </w:r>
-          </w:p>
-        </w:tc>
-        <w:tc>
-          <w:tcPr/>
-          <w:p>
-            <w:pPr>
-              <w:pStyle w:val="Compact"/>
-            </w:pPr>
-            <w:r>
-              <w:t xml:space="preserve">Change</w:t>
-            </w:r>
-          </w:p>
-        </w:tc>
-      </w:tr>
-      <w:tr>
-        <w:tc>
-          <w:tcPr/>
-          <w:p>
-            <w:pPr>
-              <w:pStyle w:val="Compact"/>
-            </w:pPr>
-            <w:r>
-              <w:t xml:space="preserve">25 agencies, each a different format</w:t>
-            </w:r>
-          </w:p>
-        </w:tc>
-        <w:tc>
-          <w:tcPr/>
-          <w:p>
-            <w:pPr>
-              <w:pStyle w:val="Compact"/>
-            </w:pPr>
-            <w:r>
-              <w:t xml:space="preserve">One hand-written parser per source</w:t>
-            </w:r>
-          </w:p>
-        </w:tc>
-        <w:tc>
-          <w:tcPr/>
-          <w:p>
-            <w:pPr>
-              <w:pStyle w:val="Compact"/>
-            </w:pPr>
-            <w:r>
-              <w:t xml:space="preserve">Parser plugin interface (</w:t>
-            </w:r>
-            <w:r>
-              <w:rPr>
-                <w:rStyle w:val="VerbatimChar"/>
-              </w:rPr>
-              <w:t xml:space="preserve">fetch / parse / natural_key / dates</w:t>
-            </w:r>
-            <w:r>
-              <w:t xml:space="preserve">) and a</w:t>
-            </w:r>
-            <w:r>
-              <w:t xml:space="preserve"> </w:t>
-            </w:r>
-            <w:r>
-              <w:rPr>
-                <w:rStyle w:val="VerbatimChar"/>
-              </w:rPr>
-              <w:t xml:space="preserve">dim_agency</w:t>
-            </w:r>
-            <w:r>
-              <w:t xml:space="preserve"> </w:t>
-            </w:r>
-            <w:r>
-              <w:t xml:space="preserve">table with parser config.</w:t>
-            </w:r>
-            <w:r>
-              <w:t xml:space="preserve"> </w:t>
-            </w:r>
-            <w:r>
-              <w:rPr>
-                <w:b/>
-                <w:bCs/>
-              </w:rPr>
-              <w:t xml:space="preserve">First thing I would change</w:t>
-            </w:r>
-            <w:r>
-              <w:t xml:space="preserve">, before any infrastructure</w:t>
-            </w:r>
-          </w:p>
-        </w:tc>
-      </w:tr>
-      <w:tr>
-        <w:tc>
-          <w:tcPr/>
-          <w:p>
-            <w:pPr>
-              <w:pStyle w:val="Compact"/>
-            </w:pPr>
-            <w:r>
-              <w:t xml:space="preserve">1M sites</w:t>
-            </w:r>
-          </w:p>
-        </w:tc>
-        <w:tc>
-          <w:tcPr/>
-          <w:p>
-            <w:pPr>
-              <w:pStyle w:val="Compact"/>
-            </w:pPr>
-            <w:r>
-              <w:t xml:space="preserve">Trigram candidate search over all of</w:t>
-            </w:r>
-            <w:r>
-              <w:t xml:space="preserve"> </w:t>
-            </w:r>
-            <w:r>
-              <w:rPr>
-                <w:rStyle w:val="VerbatimChar"/>
-              </w:rPr>
-              <w:t xml:space="preserve">dim_site</w:t>
-            </w:r>
-          </w:p>
-        </w:tc>
-        <w:tc>
-          <w:tcPr/>
-          <w:p>
-            <w:pPr>
-              <w:pStyle w:val="Compact"/>
-            </w:pPr>
-            <w:r>
-              <w:t xml:space="preserve">Candidate generation in OpenSearch (already running); batch ER on Spark with Splink for backfills</w:t>
-            </w:r>
-          </w:p>
-        </w:tc>
-      </w:tr>
-      <w:tr>
-        <w:tc>
-          <w:tcPr/>
-          <w:p>
-            <w:pPr>
-              <w:pStyle w:val="Compact"/>
-            </w:pPr>
-            <w:r>
-              <w:t xml:space="preserve">2k events/s bursts</w:t>
-            </w:r>
-          </w:p>
-        </w:tc>
-        <w:tc>
-          <w:tcPr/>
-          <w:p>
-            <w:pPr>
-              <w:pStyle w:val="Compact"/>
-            </w:pPr>
-            <w:r>
-              <w:t xml:space="preserve">Per-event Postgres writes from Lambda</w:t>
-            </w:r>
-          </w:p>
-        </w:tc>
-        <w:tc>
-          <w:tcPr/>
-          <w:p>
-            <w:pPr>
-              <w:pStyle w:val="Compact"/>
-            </w:pPr>
-            <w:r>
-              <w:t xml:space="preserve">Micro-batching (already 100/invocation), RDS Proxy; then Flink doing dedupe and version compare before Postgres</w:t>
-            </w:r>
-          </w:p>
-        </w:tc>
-      </w:tr>
-      <w:tr>
-        <w:tc>
-          <w:tcPr/>
-          <w:p>
-            <w:pPr>
-              <w:pStyle w:val="Compact"/>
-            </w:pPr>
-            <w:r>
-              <w:t xml:space="preserve">400 customers, 250k watches</w:t>
-            </w:r>
-          </w:p>
-        </w:tc>
-        <w:tc>
-          <w:tcPr/>
-          <w:p>
-            <w:pPr>
-              <w:pStyle w:val="Compact"/>
-            </w:pPr>
-            <w:r>
-              <w:t xml:space="preserve">Fan-out per event</w:t>
-            </w:r>
-          </w:p>
-        </w:tc>
-        <w:tc>
-          <w:tcPr/>
-          <w:p>
-            <w:pPr>
-              <w:pStyle w:val="Compact"/>
-            </w:pPr>
-            <w:r>
-              <w:t xml:space="preserve">DynamoDB handles it; batch notifications per customer per minute</w:t>
-            </w:r>
-          </w:p>
-        </w:tc>
-      </w:tr>
-      <w:tr>
-        <w:tc>
-          <w:tcPr/>
-          <w:p>
-            <w:pPr>
-              <w:pStyle w:val="Compact"/>
-            </w:pPr>
-            <w:r>
-              <w:t xml:space="preserve">Nightly full export</w:t>
-            </w:r>
-          </w:p>
-        </w:tc>
-        <w:tc>
-          <w:tcPr/>
-          <w:p>
-            <w:pPr>
-              <w:pStyle w:val="Compact"/>
-            </w:pPr>
-            <w:r>
-              <w:t xml:space="preserve">Gets long</w:t>
-            </w:r>
-          </w:p>
-        </w:tc>
-        <w:tc>
-          <w:tcPr/>
-          <w:p>
-            <w:pPr>
-              <w:pStyle w:val="Compact"/>
-            </w:pPr>
-            <w:r>
-              <w:t xml:space="preserve">Incremental export on</w:t>
-            </w:r>
-            <w:r>
-              <w:t xml:space="preserve"> </w:t>
-            </w:r>
-            <w:r>
-              <w:rPr>
-                <w:rStyle w:val="VerbatimChar"/>
-              </w:rPr>
-              <w:t xml:space="preserve">valid_from &gt; last run</w:t>
-            </w:r>
-          </w:p>
-        </w:tc>
-      </w:tr>
-    </w:tbl>
-    <w:p>
-      <w:pPr>
-        <w:pStyle w:val="Heading2"/>
-      </w:pPr>
-      <w:bookmarkStart w:id="45" w:name="_0a0641f445e3e0b4b0daf89f6bc9b9d2d34a50c"/>
-      <w:r>
-        <w:t xml:space="preserve">7. Six weeks with this team</w:t>
       </w:r>
       <w:bookmarkEnd w:id="45"/>
     </w:p>
@@ -13436,6 +13170,297 @@
               <w:pStyle w:val="Compact"/>
             </w:pPr>
             <w:r>
+              <w:t xml:space="preserve">Pressure</w:t>
+            </w:r>
+          </w:p>
+        </w:tc>
+        <w:tc>
+          <w:tcPr/>
+          <w:p>
+            <w:pPr>
+              <w:pStyle w:val="Compact"/>
+            </w:pPr>
+            <w:r>
+              <w:t xml:space="preserve">Breaks</w:t>
+            </w:r>
+          </w:p>
+        </w:tc>
+        <w:tc>
+          <w:tcPr/>
+          <w:p>
+            <w:pPr>
+              <w:pStyle w:val="Compact"/>
+            </w:pPr>
+            <w:r>
+              <w:t xml:space="preserve">Change</w:t>
+            </w:r>
+          </w:p>
+        </w:tc>
+      </w:tr>
+      <w:tr>
+        <w:tc>
+          <w:tcPr/>
+          <w:p>
+            <w:pPr>
+              <w:pStyle w:val="Compact"/>
+            </w:pPr>
+            <w:r>
+              <w:t xml:space="preserve">25 agencies, each a different format</w:t>
+            </w:r>
+          </w:p>
+        </w:tc>
+        <w:tc>
+          <w:tcPr/>
+          <w:p>
+            <w:pPr>
+              <w:pStyle w:val="Compact"/>
+            </w:pPr>
+            <w:r>
+              <w:t xml:space="preserve">One hand-written parser per source</w:t>
+            </w:r>
+          </w:p>
+        </w:tc>
+        <w:tc>
+          <w:tcPr/>
+          <w:p>
+            <w:pPr>
+              <w:pStyle w:val="Compact"/>
+            </w:pPr>
+            <w:r>
+              <w:t xml:space="preserve">Parser plugin interface (</w:t>
+            </w:r>
+            <w:r>
+              <w:rPr>
+                <w:rStyle w:val="VerbatimChar"/>
+              </w:rPr>
+              <w:t xml:space="preserve">fetch / parse / natural_key / dates</w:t>
+            </w:r>
+            <w:r>
+              <w:t xml:space="preserve">) and a</w:t>
+            </w:r>
+            <w:r>
+              <w:t xml:space="preserve"> </w:t>
+            </w:r>
+            <w:r>
+              <w:rPr>
+                <w:rStyle w:val="VerbatimChar"/>
+              </w:rPr>
+              <w:t xml:space="preserve">dim_agency</w:t>
+            </w:r>
+            <w:r>
+              <w:t xml:space="preserve"> </w:t>
+            </w:r>
+            <w:r>
+              <w:t xml:space="preserve">table with parser config.</w:t>
+            </w:r>
+            <w:r>
+              <w:t xml:space="preserve"> </w:t>
+            </w:r>
+            <w:r>
+              <w:rPr>
+                <w:b/>
+                <w:bCs/>
+              </w:rPr>
+              <w:t xml:space="preserve">First thing I would change</w:t>
+            </w:r>
+            <w:r>
+              <w:t xml:space="preserve">, before any infrastructure</w:t>
+            </w:r>
+          </w:p>
+        </w:tc>
+      </w:tr>
+      <w:tr>
+        <w:tc>
+          <w:tcPr/>
+          <w:p>
+            <w:pPr>
+              <w:pStyle w:val="Compact"/>
+            </w:pPr>
+            <w:r>
+              <w:t xml:space="preserve">1M sites</w:t>
+            </w:r>
+          </w:p>
+        </w:tc>
+        <w:tc>
+          <w:tcPr/>
+          <w:p>
+            <w:pPr>
+              <w:pStyle w:val="Compact"/>
+            </w:pPr>
+            <w:r>
+              <w:t xml:space="preserve">Trigram candidate search over all of</w:t>
+            </w:r>
+            <w:r>
+              <w:t xml:space="preserve"> </w:t>
+            </w:r>
+            <w:r>
+              <w:rPr>
+                <w:rStyle w:val="VerbatimChar"/>
+              </w:rPr>
+              <w:t xml:space="preserve">dim_site</w:t>
+            </w:r>
+          </w:p>
+        </w:tc>
+        <w:tc>
+          <w:tcPr/>
+          <w:p>
+            <w:pPr>
+              <w:pStyle w:val="Compact"/>
+            </w:pPr>
+            <w:r>
+              <w:t xml:space="preserve">Candidate generation in OpenSearch (already running); batch ER on Spark with Splink for backfills</w:t>
+            </w:r>
+          </w:p>
+        </w:tc>
+      </w:tr>
+      <w:tr>
+        <w:tc>
+          <w:tcPr/>
+          <w:p>
+            <w:pPr>
+              <w:pStyle w:val="Compact"/>
+            </w:pPr>
+            <w:r>
+              <w:t xml:space="preserve">2k events/s bursts</w:t>
+            </w:r>
+          </w:p>
+        </w:tc>
+        <w:tc>
+          <w:tcPr/>
+          <w:p>
+            <w:pPr>
+              <w:pStyle w:val="Compact"/>
+            </w:pPr>
+            <w:r>
+              <w:t xml:space="preserve">Per-event Postgres writes from Lambda</w:t>
+            </w:r>
+          </w:p>
+        </w:tc>
+        <w:tc>
+          <w:tcPr/>
+          <w:p>
+            <w:pPr>
+              <w:pStyle w:val="Compact"/>
+            </w:pPr>
+            <w:r>
+              <w:t xml:space="preserve">Micro-batching (already 100/invocation), RDS Proxy; then Flink doing dedupe and version compare before Postgres</w:t>
+            </w:r>
+          </w:p>
+        </w:tc>
+      </w:tr>
+      <w:tr>
+        <w:tc>
+          <w:tcPr/>
+          <w:p>
+            <w:pPr>
+              <w:pStyle w:val="Compact"/>
+            </w:pPr>
+            <w:r>
+              <w:t xml:space="preserve">400 customers, 250k watches</w:t>
+            </w:r>
+          </w:p>
+        </w:tc>
+        <w:tc>
+          <w:tcPr/>
+          <w:p>
+            <w:pPr>
+              <w:pStyle w:val="Compact"/>
+            </w:pPr>
+            <w:r>
+              <w:t xml:space="preserve">Fan-out per event</w:t>
+            </w:r>
+          </w:p>
+        </w:tc>
+        <w:tc>
+          <w:tcPr/>
+          <w:p>
+            <w:pPr>
+              <w:pStyle w:val="Compact"/>
+            </w:pPr>
+            <w:r>
+              <w:t xml:space="preserve">DynamoDB handles it; batch notifications per customer per minute</w:t>
+            </w:r>
+          </w:p>
+        </w:tc>
+      </w:tr>
+      <w:tr>
+        <w:tc>
+          <w:tcPr/>
+          <w:p>
+            <w:pPr>
+              <w:pStyle w:val="Compact"/>
+            </w:pPr>
+            <w:r>
+              <w:t xml:space="preserve">Nightly full export</w:t>
+            </w:r>
+          </w:p>
+        </w:tc>
+        <w:tc>
+          <w:tcPr/>
+          <w:p>
+            <w:pPr>
+              <w:pStyle w:val="Compact"/>
+            </w:pPr>
+            <w:r>
+              <w:t xml:space="preserve">Gets long</w:t>
+            </w:r>
+          </w:p>
+        </w:tc>
+        <w:tc>
+          <w:tcPr/>
+          <w:p>
+            <w:pPr>
+              <w:pStyle w:val="Compact"/>
+            </w:pPr>
+            <w:r>
+              <w:t xml:space="preserve">Incremental export on</w:t>
+            </w:r>
+            <w:r>
+              <w:t xml:space="preserve"> </w:t>
+            </w:r>
+            <w:r>
+              <w:rPr>
+                <w:rStyle w:val="VerbatimChar"/>
+              </w:rPr>
+              <w:t xml:space="preserve">valid_from &gt; last run</w:t>
+            </w:r>
+          </w:p>
+        </w:tc>
+      </w:tr>
+    </w:tbl>
+    <w:p>
+      <w:pPr>
+        <w:pStyle w:val="Heading2"/>
+      </w:pPr>
+      <w:bookmarkStart w:id="46" w:name="_0a0641f445e3e0b4b0daf89f6bc9b9d2d34a50c"/>
+      <w:r>
+        <w:t xml:space="preserve">7. Six weeks with this team</w:t>
+      </w:r>
+      <w:bookmarkEnd w:id="46"/>
+    </w:p>
+    <w:tbl>
+      <w:tblPr>
+        <w:tblStyle w:val="Table"/>
+        <w:tblW w:type="pct" w:w="5000"/>
+        <w:tblLayout w:type="fixed"/>
+        <w:tblLook w:firstRow="1" w:lastRow="0" w:firstColumn="0" w:lastColumn="0" w:noHBand="0" w:noVBand="0" w:val="0020"/>
+      </w:tblPr>
+      <w:tblGrid>
+        <w:gridCol w:w="2640"/>
+        <w:gridCol w:w="2640"/>
+        <w:gridCol w:w="2640"/>
+      </w:tblGrid>
+      <w:tr>
+        <w:trPr>
+          <w:tblHeader w:val="on"/>
+        </w:trPr>
+        <w:tc>
+          <w:tcPr/>
+          <w:p>
+            <w:pPr>
+              <w:pStyle w:val="Compact"/>
+            </w:pPr>
+            <w:r>
               <w:t xml:space="preserve">Weeks</w:t>
             </w:r>
           </w:p>
@@ -13596,21 +13621,21 @@
       <w:pPr>
         <w:pStyle w:val="Heading1"/>
       </w:pPr>
-      <w:bookmarkStart w:id="46" w:name="_62599194d5a392fee9acfc2cac13209c91afdf4"/>
+      <w:bookmarkStart w:id="47" w:name="_62599194d5a392fee9acfc2cac13209c91afdf4"/>
       <w:r>
         <w:t xml:space="preserve">Assumptions, AI usage, time spent</w:t>
       </w:r>
-      <w:bookmarkEnd w:id="46"/>
+      <w:bookmarkEnd w:id="47"/>
     </w:p>
     <w:p>
       <w:pPr>
         <w:pStyle w:val="Heading2"/>
       </w:pPr>
-      <w:bookmarkStart w:id="47" w:name="_assumptions"/>
+      <w:bookmarkStart w:id="48" w:name="_assumptions"/>
       <w:r>
         <w:t xml:space="preserve">Assumptions</w:t>
       </w:r>
-      <w:bookmarkEnd w:id="47"/>
+      <w:bookmarkEnd w:id="48"/>
     </w:p>
     <w:p>
       <w:pPr>
@@ -13933,11 +13958,11 @@
       <w:pPr>
         <w:pStyle w:val="Heading2"/>
       </w:pPr>
-      <w:bookmarkStart w:id="48" w:name="_63249b6f657b864a327a7fc992cdbb6ebaad32c"/>
+      <w:bookmarkStart w:id="49" w:name="_63249b6f657b864a327a7fc992cdbb6ebaad32c"/>
       <w:r>
         <w:t xml:space="preserve">How AI tools were used</w:t>
       </w:r>
-      <w:bookmarkEnd w:id="48"/>
+      <w:bookmarkEnd w:id="49"/>
     </w:p>
     <w:p>
       <w:pPr>
@@ -13990,52 +14015,28 @@
       <w:r>
         <w:t xml:space="preserve">turning those decisions into DDL, diagrams and written sections; drafting Parts B, C and D for me to edit; generating the sample-data SQL from the brief; running the DDL, sample data and the U2/U3/U4 queries on a local PostgreSQL 17 and capturing the output; catching my misunderstandings (source vs store, engine vs store) and correcting its own (an overstated claim about Snowflake transactions, fixed in Part B).</w:t>
       </w:r>
+      <w:r>
+        <w:t xml:space="preserve"> </w:t>
+      </w:r>
+      <w:r>
+        <w:t xml:space="preserve">Every design choice in this document is one I can explain and defend without the tool.</w:t>
+      </w:r>
     </w:p>
     <w:p>
       <w:pPr>
-        <w:pStyle w:val="Compact"/>
-        <w:numPr>
-          <w:ilvl w:val="0"/>
-          <w:numId w:val="1010"/>
-        </w:numPr>
+        <w:pStyle w:val="Heading2"/>
       </w:pPr>
-      <w:r>
-        <w:rPr>
-          <w:b/>
-          <w:bCs/>
-        </w:rPr>
-        <w:t xml:space="preserve">Verified:</w:t>
-      </w:r>
-      <w:r>
-        <w:t xml:space="preserve"> </w:t>
-      </w:r>
-      <w:r>
-        <w:t xml:space="preserve">all DDL and queries were executed on PostgreSQL 17 with the brief’s sample rows; results are in the appendix (U3 returns VAI for 2026-10-08 and OAI for 2026-10-13; U2 returns cust_042; the duplicate S4 event is a no-op).</w:t>
-      </w:r>
+      <w:bookmarkStart w:id="50" w:name="_4707a072b6f3d5b20db6874a789343aaa47f503"/>
+      <w:r>
+        <w:t xml:space="preserve">Time spent</w:t>
+      </w:r>
+      <w:bookmarkEnd w:id="50"/>
     </w:p>
     <w:p>
       <w:pPr>
         <w:pStyle w:val="FirstParagraph"/>
       </w:pPr>
       <w:r>
-        <w:t xml:space="preserve">Every design choice in this document is one I can explain and defend without the tool.</w:t>
-      </w:r>
-    </w:p>
-    <w:p>
-      <w:pPr>
-        <w:pStyle w:val="Heading2"/>
-      </w:pPr>
-      <w:bookmarkStart w:id="49" w:name="_4707a072b6f3d5b20db6874a789343aaa47f503"/>
-      <w:r>
-        <w:t xml:space="preserve">Time spent</w:t>
-      </w:r>
-      <w:bookmarkEnd w:id="49"/>
-    </w:p>
-    <w:p>
-      <w:pPr>
-        <w:pStyle w:val="FirstParagraph"/>
-      </w:pPr>
-      <w:r>
         <w:t xml:space="preserve">About</w:t>
       </w:r>
       <w:r>
@@ -14046,10 +14047,10 @@
           <w:b/>
           <w:bCs/>
         </w:rPr>
-        <w:t xml:space="preserve">3 hours</w:t>
-      </w:r>
-      <w:r>
-        <w:t xml:space="preserve">: data model and DDL 1 to 1.5 hours (including the queries and running them), pipeline architecture and rationale about 1.5 hours, with reading the brief and assembling the document inside that time.</w:t>
+        <w:t xml:space="preserve">3.5 to 4 hours</w:t>
+      </w:r>
+      <w:r>
+        <w:t xml:space="preserve">: reading the brief about 30 minutes, data model and DDL 1 to 1.5 hours (including the queries and running them on PostgreSQL), pipeline architecture and rationale about 1.5 hours, assembling the document the remainder.</w:t>
       </w:r>
     </w:p>
     <w:sectPr>

</xml_diff>